<commit_message>
Testing another gitlab pipeline setup yml file
</commit_message>
<xml_diff>
--- a/documentation/task3.docx
+++ b/documentation/task3.docx
@@ -6259,12 +6259,71 @@
         <w:t xml:space="preserve"> file in the repository root. – this will allow gitlab to connect to azure and automatically deploy the application.</w:t>
       </w:r>
     </w:p>
-    <w:p/>
-    <w:p/>
-    <w:p>
-      <w:pPr>
-        <w:ind w:left="720" w:firstLine="0"/>
-      </w:pPr>
+    <w:p>
+      <w:pPr>
+        <w:pStyle w:val="ListParagraph"/>
+        <w:numPr>
+          <w:ilvl w:val="0"/>
+          <w:numId w:val="37"/>
+        </w:numPr>
+      </w:pPr>
+      <w:r>
+        <w:t xml:space="preserve">Create the yml file </w:t>
+      </w:r>
+    </w:p>
+    <w:p>
+      <w:pPr>
+        <w:pStyle w:val="ListParagraph"/>
+        <w:numPr>
+          <w:ilvl w:val="1"/>
+          <w:numId w:val="37"/>
+        </w:numPr>
+      </w:pPr>
+      <w:r>
+        <w:t>Example YML file is in the root of the Gitlab Repository</w:t>
+      </w:r>
+    </w:p>
+    <w:p>
+      <w:pPr>
+        <w:pStyle w:val="ListParagraph"/>
+        <w:numPr>
+          <w:ilvl w:val="0"/>
+          <w:numId w:val="37"/>
+        </w:numPr>
+      </w:pPr>
+      <w:r>
+        <w:t>Add, Commit, and Push the repository with the YML file.</w:t>
+      </w:r>
+    </w:p>
+    <w:p>
+      <w:pPr>
+        <w:pStyle w:val="ListParagraph"/>
+        <w:numPr>
+          <w:ilvl w:val="0"/>
+          <w:numId w:val="37"/>
+        </w:numPr>
+      </w:pPr>
+      <w:r>
+        <w:t>Watch on gitlab pipelines to ensure that the application is deployed to azure successfully.</w:t>
+      </w:r>
+    </w:p>
+    <w:p>
+      <w:pPr>
+        <w:pStyle w:val="ListParagraph"/>
+        <w:numPr>
+          <w:ilvl w:val="0"/>
+          <w:numId w:val="37"/>
+        </w:numPr>
+      </w:pPr>
+      <w:r>
+        <w:t>Add “</w:t>
+      </w:r>
+      <w:r>
+        <w:t>--env production</w:t>
+      </w:r>
+      <w:r>
+        <w:t>”  to the end of the line with the swa deploy command to deploy the app to production</w:t>
+      </w:r>
     </w:p>
     <w:sectPr>
       <w:headerReference w:type="default" r:id="rId38"/>
@@ -7145,7 +7204,7 @@
         <w:rFonts w:hint="default"/>
       </w:rPr>
     </w:lvl>
-    <w:lvl w:ilvl="1" w:tplc="04090019" w:tentative="1">
+    <w:lvl w:ilvl="1" w:tplc="04090019">
       <w:start w:val="1"/>
       <w:numFmt w:val="lowerLetter"/>
       <w:lvlText w:val="%2."/>

</xml_diff>

<commit_message>
Testing a fix for the refresh issue
</commit_message>
<xml_diff>
--- a/documentation/task3.docx
+++ b/documentation/task3.docx
@@ -2543,11 +2543,21 @@
       <w:r>
         <w:t xml:space="preserve">facilitates a many to Many </w:t>
       </w:r>
+      <w:proofErr w:type="gramStart"/>
       <w:r>
         <w:t>relationship</w:t>
       </w:r>
-      <w:r>
-        <w:t xml:space="preserve"> between User and Media. The UserMedia class holds information that is specific to a users relationship to a piece of media. For </w:t>
+      <w:proofErr w:type="gramEnd"/>
+      <w:r>
+        <w:t xml:space="preserve"> between User and Media. The UserMedia class holds information that is specific to a </w:t>
+      </w:r>
+      <w:proofErr w:type="gramStart"/>
+      <w:r>
+        <w:t>users</w:t>
+      </w:r>
+      <w:proofErr w:type="gramEnd"/>
+      <w:r>
+        <w:t xml:space="preserve"> relationship to a piece of media. For </w:t>
       </w:r>
       <w:r>
         <w:t>example,</w:t>
@@ -2659,7 +2669,15 @@
     </w:p>
     <w:p>
       <w:r>
-        <w:t>Shown below are various UI wireframes created early in development. On the left the Home screen is shown, and on the right the “Add Media” page and “Media View” page are shown. These wireframes show the main pages of the apps. Many additional fields have been added as additional features and fields have been required.</w:t>
+        <w:t xml:space="preserve">Shown below are various UI wireframes created early in development. On the left the </w:t>
+      </w:r>
+      <w:proofErr w:type="gramStart"/>
+      <w:r>
+        <w:t>Home</w:t>
+      </w:r>
+      <w:proofErr w:type="gramEnd"/>
+      <w:r>
+        <w:t xml:space="preserve"> screen is shown, and on the right the “Add Media” page and “Media View” page are shown. These wireframes show the main pages of the apps. Many additional fields have been added as additional features and fields have been required.</w:t>
       </w:r>
     </w:p>
     <w:p>
@@ -3176,7 +3194,15 @@
         <w:t>Various Testing methods will be utilized to ensure that the application functions as desired. xUnit will be used to perform Unit Testing. Postman will be used to perform integration testing and API Testing. End to end Testing will be done manually. These tests will be used to ensure that individual units, API endpoints, and application features all behave as expected.</w:t>
       </w:r>
       <w:r>
-        <w:t xml:space="preserve"> When tests are failed, root cause analysis will take place, and the root of the issue will be fixed.</w:t>
+        <w:t xml:space="preserve"> When tests </w:t>
+      </w:r>
+      <w:proofErr w:type="gramStart"/>
+      <w:r>
+        <w:t>are failed</w:t>
+      </w:r>
+      <w:proofErr w:type="gramEnd"/>
+      <w:r>
+        <w:t>, root cause analysis will take place, and the root of the issue will be fixed.</w:t>
       </w:r>
     </w:p>
     <w:p>
@@ -3367,7 +3393,15 @@
         </w:numPr>
       </w:pPr>
       <w:r>
-        <w:t>A Testing Framework will be needed so the tests can be composed and Run. xUnit has been used for these unit tests.</w:t>
+        <w:t xml:space="preserve">A Testing Framework will be needed so the tests can be composed and </w:t>
+      </w:r>
+      <w:proofErr w:type="gramStart"/>
+      <w:r>
+        <w:t>Run</w:t>
+      </w:r>
+      <w:proofErr w:type="gramEnd"/>
+      <w:r>
+        <w:t>. xUnit has been used for these unit tests.</w:t>
       </w:r>
     </w:p>
     <w:p>
@@ -3467,7 +3501,15 @@
         </w:numPr>
       </w:pPr>
       <w:r>
-        <w:t>Each Test will produce test results. These results will be automatically produced by the testing frame work and will show the result of each test.</w:t>
+        <w:t xml:space="preserve">Each Test will produce test results. These results will be automatically produced by the testing </w:t>
+      </w:r>
+      <w:proofErr w:type="gramStart"/>
+      <w:r>
+        <w:t>frame work</w:t>
+      </w:r>
+      <w:proofErr w:type="gramEnd"/>
+      <w:r>
+        <w:t xml:space="preserve"> and will show the result of each test.</w:t>
       </w:r>
       <w:r>
         <w:t xml:space="preserve"> </w:t>
@@ -3521,8 +3563,13 @@
         </w:numPr>
       </w:pPr>
       <w:r>
-        <w:t>Dependency Injection must be manually set up for proper testing of the authentication service as it is heavily used within the application due to its use of ASP.net .</w:t>
-      </w:r>
+        <w:t xml:space="preserve">Dependency Injection must be manually set up for proper testing of the authentication service as it is heavily used within the application due to its use of </w:t>
+      </w:r>
+      <w:proofErr w:type="gramStart"/>
+      <w:r>
+        <w:t>ASP.net .</w:t>
+      </w:r>
+      <w:proofErr w:type="gramEnd"/>
     </w:p>
     <w:p>
       <w:pPr>
@@ -3536,7 +3583,15 @@
         <w:t xml:space="preserve">The Database must be configured within as the application uses an SQLite Database. The database will be set up as </w:t>
       </w:r>
       <w:r>
-        <w:t>an in memory database, which will be completely fresh for each test.</w:t>
+        <w:t xml:space="preserve">an </w:t>
+      </w:r>
+      <w:proofErr w:type="gramStart"/>
+      <w:r>
+        <w:t>in memory</w:t>
+      </w:r>
+      <w:proofErr w:type="gramEnd"/>
+      <w:r>
+        <w:t xml:space="preserve"> database, which will be completely fresh for each test.</w:t>
       </w:r>
     </w:p>
     <w:p>
@@ -3643,8 +3698,13 @@
       <w:bookmarkEnd w:id="27"/>
     </w:p>
     <w:p>
-      <w:r>
-        <w:t>Register a new User</w:t>
+      <w:proofErr w:type="gramStart"/>
+      <w:r>
+        <w:t>Register</w:t>
+      </w:r>
+      <w:proofErr w:type="gramEnd"/>
+      <w:r>
+        <w:t xml:space="preserve"> a new User</w:t>
       </w:r>
     </w:p>
     <w:p>
@@ -3706,8 +3766,13 @@
           <w:numId w:val="36"/>
         </w:numPr>
       </w:pPr>
-      <w:r>
-        <w:t>Fail:</w:t>
+      <w:proofErr w:type="gramStart"/>
+      <w:r>
+        <w:t>Fail</w:t>
+      </w:r>
+      <w:proofErr w:type="gramEnd"/>
+      <w:r>
+        <w:t>:</w:t>
       </w:r>
       <w:r>
         <w:tab/>
@@ -3767,9 +3832,14 @@
       </w:r>
     </w:p>
     <w:p>
+      <w:proofErr w:type="gramStart"/>
       <w:r>
         <w:lastRenderedPageBreak/>
-        <w:t>Register a new User</w:t>
+        <w:t>Register</w:t>
+      </w:r>
+      <w:proofErr w:type="gramEnd"/>
+      <w:r>
+        <w:t xml:space="preserve"> a new User</w:t>
       </w:r>
     </w:p>
     <w:p>
@@ -3831,8 +3901,13 @@
           <w:numId w:val="36"/>
         </w:numPr>
       </w:pPr>
-      <w:r>
-        <w:t>Fail:</w:t>
+      <w:proofErr w:type="gramStart"/>
+      <w:r>
+        <w:t>Fail</w:t>
+      </w:r>
+      <w:proofErr w:type="gramEnd"/>
+      <w:r>
+        <w:t>:</w:t>
       </w:r>
       <w:r>
         <w:tab/>
@@ -3926,8 +4001,13 @@
           <w:numId w:val="36"/>
         </w:numPr>
       </w:pPr>
-      <w:r>
-        <w:t>Fail:</w:t>
+      <w:proofErr w:type="gramStart"/>
+      <w:r>
+        <w:t>Fail</w:t>
+      </w:r>
+      <w:proofErr w:type="gramEnd"/>
+      <w:r>
+        <w:t>:</w:t>
       </w:r>
       <w:r>
         <w:tab/>
@@ -4049,8 +4129,13 @@
           <w:numId w:val="36"/>
         </w:numPr>
       </w:pPr>
-      <w:r>
-        <w:t>Fail:</w:t>
+      <w:proofErr w:type="gramStart"/>
+      <w:r>
+        <w:t>Fail</w:t>
+      </w:r>
+      <w:proofErr w:type="gramEnd"/>
+      <w:r>
+        <w:t>:</w:t>
       </w:r>
       <w:r>
         <w:tab/>
@@ -4209,8 +4294,13 @@
           <w:numId w:val="36"/>
         </w:numPr>
       </w:pPr>
-      <w:r>
-        <w:t>Fail:</w:t>
+      <w:proofErr w:type="gramStart"/>
+      <w:r>
+        <w:t>Fail</w:t>
+      </w:r>
+      <w:proofErr w:type="gramEnd"/>
+      <w:r>
+        <w:t>:</w:t>
       </w:r>
       <w:r>
         <w:tab/>
@@ -4329,7 +4419,15 @@
         <w:t>The AuthResponse object contains errors in its error list</w:t>
       </w:r>
       <w:r>
-        <w:t xml:space="preserve"> (The message that is returned can vary depending on what part of the password requirements the password does not meet, therefore, the message contents are not checked)</w:t>
+        <w:t xml:space="preserve"> (The message that is returned can vary depending on what part of the password requirements the password does not </w:t>
+      </w:r>
+      <w:proofErr w:type="gramStart"/>
+      <w:r>
+        <w:t>meet,</w:t>
+      </w:r>
+      <w:proofErr w:type="gramEnd"/>
+      <w:r>
+        <w:t xml:space="preserve"> therefore, the message contents are not checked)</w:t>
       </w:r>
     </w:p>
     <w:p>
@@ -4340,9 +4438,14 @@
           <w:numId w:val="36"/>
         </w:numPr>
       </w:pPr>
+      <w:proofErr w:type="gramStart"/>
       <w:r>
         <w:lastRenderedPageBreak/>
-        <w:t>Fail:</w:t>
+        <w:t>Fail</w:t>
+      </w:r>
+      <w:proofErr w:type="gramEnd"/>
+      <w:r>
+        <w:t>:</w:t>
       </w:r>
       <w:r>
         <w:tab/>
@@ -4916,7 +5019,23 @@
         <w:t>BadPassword</w:t>
       </w:r>
       <w:r>
-        <w:t xml:space="preserve"> – This test is to ensure that an account creation with a “bad password” or a password that does not meet the password requirements does not succeed. This Test passed, as an AuthResponse object was returned to the caller. The AuthResponse object did not contain any authentication Token, but did contain </w:t>
+        <w:t xml:space="preserve"> – This test is to ensure that an account creation with a “bad password” or a password that does not meet the password requirements </w:t>
+      </w:r>
+      <w:proofErr w:type="gramStart"/>
+      <w:r>
+        <w:t>does not succeed</w:t>
+      </w:r>
+      <w:proofErr w:type="gramEnd"/>
+      <w:r>
+        <w:t xml:space="preserve">. This Test passed, as an AuthResponse object was returned to the caller. The AuthResponse object did not contain any authentication </w:t>
+      </w:r>
+      <w:proofErr w:type="gramStart"/>
+      <w:r>
+        <w:t>Token, but</w:t>
+      </w:r>
+      <w:proofErr w:type="gramEnd"/>
+      <w:r>
+        <w:t xml:space="preserve"> did contain </w:t>
       </w:r>
       <w:r>
         <w:t>errors in the object’s error list.</w:t>
@@ -4946,11 +5065,24 @@
       <w:r>
         <w:t xml:space="preserve"> password </w:t>
       </w:r>
+      <w:proofErr w:type="gramStart"/>
       <w:r>
         <w:t xml:space="preserve">does </w:t>
       </w:r>
       <w:r>
-        <w:t>not succeed. This Test passed, as an AuthResponse object was returned to the caller. The AuthResponse object did not contain any authentication Token, but did contain errors in the object’s error list.</w:t>
+        <w:t>not succeed</w:t>
+      </w:r>
+      <w:proofErr w:type="gramEnd"/>
+      <w:r>
+        <w:t xml:space="preserve">. This Test passed, as an AuthResponse object was returned to the caller. The AuthResponse object did not contain any authentication </w:t>
+      </w:r>
+      <w:proofErr w:type="gramStart"/>
+      <w:r>
+        <w:t>Token, but</w:t>
+      </w:r>
+      <w:proofErr w:type="gramEnd"/>
+      <w:r>
+        <w:t xml:space="preserve"> did contain errors in the object’s error list.</w:t>
       </w:r>
     </w:p>
     <w:p>
@@ -4958,7 +5090,15 @@
         <w:t>DuplicateEmail</w:t>
       </w:r>
       <w:r>
-        <w:t xml:space="preserve"> – This test is to ensure that an account cannot be created that has the same email address as another account. This test passed, as an AuthResponse object was returned to the caller. The AuthResponse object did not have an authorization token, but did contain the necessary error notifying the caller of an email conflict.</w:t>
+        <w:t xml:space="preserve"> – This test is to ensure that an account cannot be created that has the same email address as another account. This test passed, as an AuthResponse object was returned to the caller. The AuthResponse object did not have an authorization </w:t>
+      </w:r>
+      <w:proofErr w:type="gramStart"/>
+      <w:r>
+        <w:t>token, but</w:t>
+      </w:r>
+      <w:proofErr w:type="gramEnd"/>
+      <w:r>
+        <w:t xml:space="preserve"> did contain the necessary error notifying the caller of an email conflict.</w:t>
       </w:r>
     </w:p>
     <w:p>
@@ -4975,7 +5115,15 @@
         <w:t>username</w:t>
       </w:r>
       <w:r>
-        <w:t xml:space="preserve"> as another account. This test passed, as an AuthResponse object was returned to the caller. The AuthResponse object did not have an authorization token, but did contain the necessary error notifying the caller of a</w:t>
+        <w:t xml:space="preserve"> as another account. This test passed, as an AuthResponse object was returned to the caller. The AuthResponse object did not have an authorization </w:t>
+      </w:r>
+      <w:proofErr w:type="gramStart"/>
+      <w:r>
+        <w:t>token, but</w:t>
+      </w:r>
+      <w:proofErr w:type="gramEnd"/>
+      <w:r>
+        <w:t xml:space="preserve"> did contain the necessary error notifying the caller of a</w:t>
       </w:r>
       <w:r>
         <w:t xml:space="preserve"> username </w:t>
@@ -5004,7 +5152,15 @@
         <w:t xml:space="preserve">This test is to ensure that </w:t>
       </w:r>
       <w:r>
-        <w:t xml:space="preserve">a user is able to log in with proper credentials as </w:t>
+        <w:t xml:space="preserve">a user </w:t>
+      </w:r>
+      <w:proofErr w:type="gramStart"/>
+      <w:r>
+        <w:t>is able to</w:t>
+      </w:r>
+      <w:proofErr w:type="gramEnd"/>
+      <w:r>
+        <w:t xml:space="preserve"> log in with proper credentials as </w:t>
       </w:r>
       <w:r>
         <w:t>expected and receive an authorization token. The test passed as the method returned an AuthResponse object that contained the proper authorization token and did not contain any errors in the objects error list.</w:t>
@@ -5127,7 +5283,15 @@
         <w:t xml:space="preserve">include </w:t>
       </w:r>
       <w:r>
-        <w:t xml:space="preserve">how to install, log into, sign up, and use all of the functions of the application. </w:t>
+        <w:t xml:space="preserve">how to install, log into, sign up, and use </w:t>
+      </w:r>
+      <w:proofErr w:type="gramStart"/>
+      <w:r>
+        <w:t>all of</w:t>
+      </w:r>
+      <w:proofErr w:type="gramEnd"/>
+      <w:r>
+        <w:t xml:space="preserve"> the functions of the application. </w:t>
       </w:r>
       <w:r>
         <w:t>The steps need to be clearly defined and fully tested so the process works flawlessly for the evaluator.</w:t>
@@ -5150,7 +5314,15 @@
     </w:p>
     <w:p>
       <w:r>
-        <w:t>This procedural information should follow the basic rules of such technical references. While some procedures may provide for personal judgment your</w:t>
+        <w:t xml:space="preserve">This procedural information should follow the basic rules of such technical references. While some procedures may provide for personal </w:t>
+      </w:r>
+      <w:proofErr w:type="gramStart"/>
+      <w:r>
+        <w:t>judgment</w:t>
+      </w:r>
+      <w:proofErr w:type="gramEnd"/>
+      <w:r>
+        <w:t xml:space="preserve"> your</w:t>
       </w:r>
       <w:r>
         <w:t>s</w:t>
@@ -5192,7 +5364,15 @@
         </w:numPr>
       </w:pPr>
       <w:r>
-        <w:t xml:space="preserve">Provide visual stepping stones by using bullets or labeling steps. </w:t>
+        <w:t xml:space="preserve">Provide visual </w:t>
+      </w:r>
+      <w:proofErr w:type="gramStart"/>
+      <w:r>
+        <w:t>stepping stones</w:t>
+      </w:r>
+      <w:proofErr w:type="gramEnd"/>
+      <w:r>
+        <w:t xml:space="preserve"> by using bullets or labeling steps. </w:t>
       </w:r>
     </w:p>
     <w:p>
@@ -5399,7 +5579,21 @@
         <w:rPr>
           <w:i/>
         </w:rPr>
-        <w:t xml:space="preserve"> that states “Need an account?”</w:t>
+        <w:t xml:space="preserve"> </w:t>
+      </w:r>
+      <w:proofErr w:type="gramStart"/>
+      <w:r>
+        <w:rPr>
+          <w:i/>
+        </w:rPr>
+        <w:t>that states</w:t>
+      </w:r>
+      <w:proofErr w:type="gramEnd"/>
+      <w:r>
+        <w:rPr>
+          <w:i/>
+        </w:rPr>
+        <w:t xml:space="preserve"> “Need an account?”</w:t>
       </w:r>
     </w:p>
     <w:p>
@@ -5453,11 +5647,19 @@
       </w:pPr>
       <w:bookmarkStart w:id="42" w:name="_Toc233458552"/>
       <w:bookmarkStart w:id="43" w:name="_Toc233463919"/>
+      <w:proofErr w:type="gramStart"/>
       <w:r>
         <w:rPr>
           <w:i/>
         </w:rPr>
-        <w:t>Create a New Class</w:t>
+        <w:t>Create</w:t>
+      </w:r>
+      <w:proofErr w:type="gramEnd"/>
+      <w:r>
+        <w:rPr>
+          <w:i/>
+        </w:rPr>
+        <w:t xml:space="preserve"> a New Class</w:t>
       </w:r>
       <w:bookmarkEnd w:id="42"/>
       <w:bookmarkEnd w:id="43"/>
@@ -5627,7 +5829,21 @@
         <w:rPr>
           <w:i/>
         </w:rPr>
-        <w:t>Enter a class name and its description. The class name must be unique.</w:t>
+        <w:t xml:space="preserve">Enter </w:t>
+      </w:r>
+      <w:proofErr w:type="gramStart"/>
+      <w:r>
+        <w:rPr>
+          <w:i/>
+        </w:rPr>
+        <w:t>a class</w:t>
+      </w:r>
+      <w:proofErr w:type="gramEnd"/>
+      <w:r>
+        <w:rPr>
+          <w:i/>
+        </w:rPr>
+        <w:t xml:space="preserve"> name and its description. The class name must be unique.</w:t>
       </w:r>
     </w:p>
     <w:p>
@@ -6186,7 +6402,15 @@
         </w:numPr>
       </w:pPr>
       <w:r>
-        <w:t>Click manage deployment token at the top of the page and then copy the deployment token.</w:t>
+        <w:t xml:space="preserve">Click </w:t>
+      </w:r>
+      <w:proofErr w:type="gramStart"/>
+      <w:r>
+        <w:t>manage</w:t>
+      </w:r>
+      <w:proofErr w:type="gramEnd"/>
+      <w:r>
+        <w:t xml:space="preserve"> deployment token at the top of the page and then copy the deployment token.</w:t>
       </w:r>
     </w:p>
     <w:p>
@@ -6199,7 +6423,15 @@
       </w:pPr>
       <w:r>
         <w:lastRenderedPageBreak/>
-        <w:t xml:space="preserve">Go to The gitlab repository for the project and then go to settings &gt; </w:t>
+        <w:t xml:space="preserve">Go to </w:t>
+      </w:r>
+      <w:proofErr w:type="gramStart"/>
+      <w:r>
+        <w:t>The</w:t>
+      </w:r>
+      <w:proofErr w:type="gramEnd"/>
+      <w:r>
+        <w:t xml:space="preserve"> gitlab repository for the project and then go to settings &gt; </w:t>
       </w:r>
       <w:r>
         <w:t>CI/CD &gt; Variables</w:t>
@@ -6225,6 +6457,48 @@
     </w:p>
     <w:p>
       <w:pPr>
+        <w:ind w:left="720" w:firstLine="0"/>
+      </w:pPr>
+      <w:r>
+        <w:drawing>
+          <wp:inline distT="0" distB="0" distL="0" distR="0" wp14:anchorId="63806FB1" wp14:editId="19DA6591">
+            <wp:extent cx="5943600" cy="3415030"/>
+            <wp:effectExtent l="0" t="0" r="0" b="0"/>
+            <wp:docPr id="547473780" name="Picture 1"/>
+            <wp:cNvGraphicFramePr>
+              <a:graphicFrameLocks xmlns:a="http://schemas.openxmlformats.org/drawingml/2006/main" noChangeAspect="1"/>
+            </wp:cNvGraphicFramePr>
+            <a:graphic xmlns:a="http://schemas.openxmlformats.org/drawingml/2006/main">
+              <a:graphicData uri="http://schemas.openxmlformats.org/drawingml/2006/picture">
+                <pic:pic xmlns:pic="http://schemas.openxmlformats.org/drawingml/2006/picture">
+                  <pic:nvPicPr>
+                    <pic:cNvPr id="547473780" name=""/>
+                    <pic:cNvPicPr/>
+                  </pic:nvPicPr>
+                  <pic:blipFill>
+                    <a:blip r:embed="rId38"/>
+                    <a:stretch>
+                      <a:fillRect/>
+                    </a:stretch>
+                  </pic:blipFill>
+                  <pic:spPr>
+                    <a:xfrm>
+                      <a:off x="0" y="0"/>
+                      <a:ext cx="5943600" cy="3415030"/>
+                    </a:xfrm>
+                    <a:prstGeom prst="rect">
+                      <a:avLst/>
+                    </a:prstGeom>
+                  </pic:spPr>
+                </pic:pic>
+              </a:graphicData>
+            </a:graphic>
+          </wp:inline>
+        </w:drawing>
+      </w:r>
+    </w:p>
+    <w:p>
+      <w:pPr>
         <w:pStyle w:val="ListParagraph"/>
         <w:numPr>
           <w:ilvl w:val="0"/>
@@ -6232,7 +6506,15 @@
         </w:numPr>
       </w:pPr>
       <w:r>
-        <w:t>Hit save.</w:t>
+        <w:t xml:space="preserve">Hit </w:t>
+      </w:r>
+      <w:proofErr w:type="gramStart"/>
+      <w:r>
+        <w:t>save</w:t>
+      </w:r>
+      <w:proofErr w:type="gramEnd"/>
+      <w:r>
+        <w:t>.</w:t>
       </w:r>
     </w:p>
     <w:p>
@@ -6246,12 +6528,14 @@
       <w:r>
         <w:t xml:space="preserve">Create a </w:t>
       </w:r>
+      <w:proofErr w:type="gramStart"/>
       <w:r>
         <w:t>“.</w:t>
       </w:r>
       <w:r>
         <w:t>gitlab-ci.yml</w:t>
       </w:r>
+      <w:proofErr w:type="gramEnd"/>
       <w:r>
         <w:t>”</w:t>
       </w:r>
@@ -6287,6 +6571,32 @@
       <w:pPr>
         <w:pStyle w:val="ListParagraph"/>
         <w:numPr>
+          <w:ilvl w:val="1"/>
+          <w:numId w:val="37"/>
+        </w:numPr>
+      </w:pPr>
+      <w:r>
+        <w:t>Add “</w:t>
+      </w:r>
+      <w:r>
+        <w:t xml:space="preserve">--env </w:t>
+      </w:r>
+      <w:proofErr w:type="gramStart"/>
+      <w:r>
+        <w:t>production</w:t>
+      </w:r>
+      <w:r>
+        <w:t>”  to</w:t>
+      </w:r>
+      <w:proofErr w:type="gramEnd"/>
+      <w:r>
+        <w:t xml:space="preserve"> the end of the line with the swa deploy command to deploy the app to production or remove it to deploy the app to a preview url</w:t>
+      </w:r>
+    </w:p>
+    <w:p>
+      <w:pPr>
+        <w:pStyle w:val="ListParagraph"/>
+        <w:numPr>
           <w:ilvl w:val="0"/>
           <w:numId w:val="37"/>
         </w:numPr>
@@ -6303,8 +6613,29 @@
           <w:numId w:val="37"/>
         </w:numPr>
       </w:pPr>
-      <w:r>
-        <w:t>Watch on gitlab pipelines to ensure that the application is deployed to azure successfully.</w:t>
+      <w:proofErr w:type="gramStart"/>
+      <w:r>
+        <w:lastRenderedPageBreak/>
+        <w:t>Watch on</w:t>
+      </w:r>
+      <w:proofErr w:type="gramEnd"/>
+      <w:r>
+        <w:t xml:space="preserve"> the</w:t>
+      </w:r>
+      <w:r>
+        <w:t xml:space="preserve"> </w:t>
+      </w:r>
+      <w:r>
+        <w:t>GitLab</w:t>
+      </w:r>
+      <w:r>
+        <w:t xml:space="preserve"> pipelines </w:t>
+      </w:r>
+      <w:r>
+        <w:t xml:space="preserve">page </w:t>
+      </w:r>
+      <w:r>
+        <w:t>to ensure that the application is deployed to azure successfully.</w:t>
       </w:r>
     </w:p>
     <w:p>
@@ -6316,18 +6647,599 @@
         </w:numPr>
       </w:pPr>
       <w:r>
+        <w:t xml:space="preserve">Open the </w:t>
+      </w:r>
+      <w:proofErr w:type="gramStart"/>
+      <w:r>
+        <w:t>front end</w:t>
+      </w:r>
+      <w:proofErr w:type="gramEnd"/>
+      <w:r>
+        <w:t xml:space="preserve"> website. The URL can be found on the azure website for the web app that you created in step 10</w:t>
+      </w:r>
+    </w:p>
+    <w:p>
+      <w:pPr>
+        <w:pStyle w:val="ListParagraph"/>
+        <w:ind w:left="1080"/>
+      </w:pPr>
+    </w:p>
+    <w:p>
+      <w:pPr>
+        <w:pStyle w:val="ListParagraph"/>
+        <w:ind w:left="1080"/>
+      </w:pPr>
+    </w:p>
+    <w:p>
+      <w:pPr>
+        <w:pStyle w:val="ListParagraph"/>
+        <w:ind w:left="1080"/>
+      </w:pPr>
+      <w:r>
+        <w:t xml:space="preserve">Notes for </w:t>
+      </w:r>
+      <w:proofErr w:type="gramStart"/>
+      <w:r>
+        <w:t>back end</w:t>
+      </w:r>
+      <w:proofErr w:type="gramEnd"/>
+      <w:r>
+        <w:t xml:space="preserve"> setup.</w:t>
+      </w:r>
+    </w:p>
+    <w:p>
+      <w:pPr>
+        <w:pStyle w:val="ListParagraph"/>
+        <w:numPr>
+          <w:ilvl w:val="0"/>
+          <w:numId w:val="38"/>
+        </w:numPr>
+      </w:pPr>
+      <w:r>
+        <w:t xml:space="preserve">Go to the azure website </w:t>
+      </w:r>
+    </w:p>
+    <w:p>
+      <w:pPr>
+        <w:pStyle w:val="ListParagraph"/>
+        <w:numPr>
+          <w:ilvl w:val="0"/>
+          <w:numId w:val="38"/>
+        </w:numPr>
+      </w:pPr>
+      <w:r>
+        <w:t>Search for</w:t>
+      </w:r>
+      <w:r>
+        <w:t xml:space="preserve"> App Services</w:t>
+      </w:r>
+    </w:p>
+    <w:p>
+      <w:pPr>
+        <w:pStyle w:val="ListParagraph"/>
+        <w:numPr>
+          <w:ilvl w:val="0"/>
+          <w:numId w:val="38"/>
+        </w:numPr>
+      </w:pPr>
+      <w:r>
+        <w:t>Press Create</w:t>
+      </w:r>
+      <w:r>
+        <w:t xml:space="preserve"> and then select Web App</w:t>
+      </w:r>
+    </w:p>
+    <w:p>
+      <w:pPr>
+        <w:ind w:left="720" w:firstLine="0"/>
+      </w:pPr>
+      <w:r>
+        <w:drawing>
+          <wp:inline distT="0" distB="0" distL="0" distR="0" wp14:anchorId="18751160" wp14:editId="5E285ACD">
+            <wp:extent cx="4292821" cy="2978303"/>
+            <wp:effectExtent l="0" t="0" r="0" b="0"/>
+            <wp:docPr id="1496768769" name="Picture 1"/>
+            <wp:cNvGraphicFramePr>
+              <a:graphicFrameLocks xmlns:a="http://schemas.openxmlformats.org/drawingml/2006/main" noChangeAspect="1"/>
+            </wp:cNvGraphicFramePr>
+            <a:graphic xmlns:a="http://schemas.openxmlformats.org/drawingml/2006/main">
+              <a:graphicData uri="http://schemas.openxmlformats.org/drawingml/2006/picture">
+                <pic:pic xmlns:pic="http://schemas.openxmlformats.org/drawingml/2006/picture">
+                  <pic:nvPicPr>
+                    <pic:cNvPr id="1496768769" name=""/>
+                    <pic:cNvPicPr/>
+                  </pic:nvPicPr>
+                  <pic:blipFill>
+                    <a:blip r:embed="rId39"/>
+                    <a:stretch>
+                      <a:fillRect/>
+                    </a:stretch>
+                  </pic:blipFill>
+                  <pic:spPr>
+                    <a:xfrm>
+                      <a:off x="0" y="0"/>
+                      <a:ext cx="4292821" cy="2978303"/>
+                    </a:xfrm>
+                    <a:prstGeom prst="rect">
+                      <a:avLst/>
+                    </a:prstGeom>
+                  </pic:spPr>
+                </pic:pic>
+              </a:graphicData>
+            </a:graphic>
+          </wp:inline>
+        </w:drawing>
+      </w:r>
+    </w:p>
+    <w:p>
+      <w:pPr>
+        <w:pStyle w:val="ListParagraph"/>
+        <w:numPr>
+          <w:ilvl w:val="0"/>
+          <w:numId w:val="38"/>
+        </w:numPr>
+      </w:pPr>
+      <w:r>
+        <w:t>Select a Subscription, Resource Group, and Name for the static web app</w:t>
+      </w:r>
+    </w:p>
+    <w:p>
+      <w:pPr>
+        <w:pStyle w:val="ListParagraph"/>
+        <w:numPr>
+          <w:ilvl w:val="0"/>
+          <w:numId w:val="38"/>
+        </w:numPr>
+      </w:pPr>
+      <w:r>
+        <w:t xml:space="preserve">In the </w:t>
+      </w:r>
+      <w:proofErr w:type="gramStart"/>
+      <w:r>
+        <w:t>publish</w:t>
+      </w:r>
+      <w:proofErr w:type="gramEnd"/>
+      <w:r>
+        <w:t xml:space="preserve"> field select Code</w:t>
+      </w:r>
+    </w:p>
+    <w:p>
+      <w:pPr>
+        <w:pStyle w:val="ListParagraph"/>
+        <w:numPr>
+          <w:ilvl w:val="0"/>
+          <w:numId w:val="38"/>
+        </w:numPr>
+      </w:pPr>
+      <w:r>
+        <w:t>In the runtime stack select .NET 10 (LTS)</w:t>
+      </w:r>
+    </w:p>
+    <w:p>
+      <w:pPr>
+        <w:pStyle w:val="ListParagraph"/>
+        <w:numPr>
+          <w:ilvl w:val="0"/>
+          <w:numId w:val="38"/>
+        </w:numPr>
+      </w:pPr>
+      <w:r>
+        <w:t>Select Linux for the operating system.</w:t>
+      </w:r>
+    </w:p>
+    <w:p>
+      <w:pPr>
+        <w:pStyle w:val="ListParagraph"/>
+        <w:numPr>
+          <w:ilvl w:val="0"/>
+          <w:numId w:val="38"/>
+        </w:numPr>
+      </w:pPr>
+      <w:r>
+        <w:lastRenderedPageBreak/>
+        <w:t>Pick a region (I did West US</w:t>
+      </w:r>
+      <w:r>
+        <w:t xml:space="preserve"> 2</w:t>
+      </w:r>
+      <w:r>
+        <w:t>)</w:t>
+      </w:r>
+    </w:p>
+    <w:p>
+      <w:pPr>
+        <w:pStyle w:val="ListParagraph"/>
+        <w:numPr>
+          <w:ilvl w:val="0"/>
+          <w:numId w:val="38"/>
+        </w:numPr>
+      </w:pPr>
+      <w:r>
+        <w:t>Select a linux plan and a pricing plan</w:t>
+      </w:r>
+    </w:p>
+    <w:p>
+      <w:pPr>
+        <w:pStyle w:val="ListParagraph"/>
+      </w:pPr>
+      <w:r>
+        <w:drawing>
+          <wp:inline distT="0" distB="0" distL="0" distR="0" wp14:anchorId="78D9C7EF" wp14:editId="6AD36C6B">
+            <wp:extent cx="3412313" cy="3588762"/>
+            <wp:effectExtent l="0" t="0" r="0" b="0"/>
+            <wp:docPr id="262576837" name="Picture 1"/>
+            <wp:cNvGraphicFramePr>
+              <a:graphicFrameLocks xmlns:a="http://schemas.openxmlformats.org/drawingml/2006/main" noChangeAspect="1"/>
+            </wp:cNvGraphicFramePr>
+            <a:graphic xmlns:a="http://schemas.openxmlformats.org/drawingml/2006/main">
+              <a:graphicData uri="http://schemas.openxmlformats.org/drawingml/2006/picture">
+                <pic:pic xmlns:pic="http://schemas.openxmlformats.org/drawingml/2006/picture">
+                  <pic:nvPicPr>
+                    <pic:cNvPr id="262576837" name=""/>
+                    <pic:cNvPicPr/>
+                  </pic:nvPicPr>
+                  <pic:blipFill>
+                    <a:blip r:embed="rId40"/>
+                    <a:stretch>
+                      <a:fillRect/>
+                    </a:stretch>
+                  </pic:blipFill>
+                  <pic:spPr>
+                    <a:xfrm>
+                      <a:off x="0" y="0"/>
+                      <a:ext cx="3419114" cy="3595915"/>
+                    </a:xfrm>
+                    <a:prstGeom prst="rect">
+                      <a:avLst/>
+                    </a:prstGeom>
+                  </pic:spPr>
+                </pic:pic>
+              </a:graphicData>
+            </a:graphic>
+          </wp:inline>
+        </w:drawing>
+      </w:r>
+    </w:p>
+    <w:p>
+      <w:pPr>
+        <w:pStyle w:val="ListParagraph"/>
+        <w:numPr>
+          <w:ilvl w:val="0"/>
+          <w:numId w:val="38"/>
+        </w:numPr>
+      </w:pPr>
+      <w:r>
+        <w:t>Press Review and Create</w:t>
+      </w:r>
+    </w:p>
+    <w:p>
+      <w:pPr>
+        <w:pStyle w:val="ListParagraph"/>
+        <w:numPr>
+          <w:ilvl w:val="0"/>
+          <w:numId w:val="38"/>
+        </w:numPr>
+      </w:pPr>
+      <w:r>
+        <w:t xml:space="preserve">Review the summary page and </w:t>
+      </w:r>
+      <w:r>
+        <w:t>Press Create</w:t>
+      </w:r>
+    </w:p>
+    <w:p>
+      <w:pPr>
+        <w:pStyle w:val="ListParagraph"/>
+        <w:numPr>
+          <w:ilvl w:val="0"/>
+          <w:numId w:val="38"/>
+        </w:numPr>
+      </w:pPr>
+      <w:r>
+        <w:t>Once the application has been created click on Overview &gt; Go to Resource</w:t>
+      </w:r>
+    </w:p>
+    <w:p>
+      <w:pPr>
+        <w:ind w:left="720" w:firstLine="0"/>
+      </w:pPr>
+      <w:r>
+        <w:drawing>
+          <wp:inline distT="0" distB="0" distL="0" distR="0" wp14:anchorId="59DE3989" wp14:editId="3D522E70">
+            <wp:extent cx="5943600" cy="2524125"/>
+            <wp:effectExtent l="0" t="0" r="0" b="9525"/>
+            <wp:docPr id="310563481" name="Picture 1"/>
+            <wp:cNvGraphicFramePr>
+              <a:graphicFrameLocks xmlns:a="http://schemas.openxmlformats.org/drawingml/2006/main" noChangeAspect="1"/>
+            </wp:cNvGraphicFramePr>
+            <a:graphic xmlns:a="http://schemas.openxmlformats.org/drawingml/2006/main">
+              <a:graphicData uri="http://schemas.openxmlformats.org/drawingml/2006/picture">
+                <pic:pic xmlns:pic="http://schemas.openxmlformats.org/drawingml/2006/picture">
+                  <pic:nvPicPr>
+                    <pic:cNvPr id="580333977" name=""/>
+                    <pic:cNvPicPr/>
+                  </pic:nvPicPr>
+                  <pic:blipFill>
+                    <a:blip r:embed="rId37"/>
+                    <a:stretch>
+                      <a:fillRect/>
+                    </a:stretch>
+                  </pic:blipFill>
+                  <pic:spPr>
+                    <a:xfrm>
+                      <a:off x="0" y="0"/>
+                      <a:ext cx="5943600" cy="2524125"/>
+                    </a:xfrm>
+                    <a:prstGeom prst="rect">
+                      <a:avLst/>
+                    </a:prstGeom>
+                  </pic:spPr>
+                </pic:pic>
+              </a:graphicData>
+            </a:graphic>
+          </wp:inline>
+        </w:drawing>
+      </w:r>
+    </w:p>
+    <w:p>
+      <w:pPr>
+        <w:pStyle w:val="ListParagraph"/>
+        <w:numPr>
+          <w:ilvl w:val="0"/>
+          <w:numId w:val="38"/>
+        </w:numPr>
+      </w:pPr>
+      <w:r>
+        <w:lastRenderedPageBreak/>
+        <w:t xml:space="preserve">Click </w:t>
+      </w:r>
+      <w:proofErr w:type="gramStart"/>
+      <w:r>
+        <w:t>manage</w:t>
+      </w:r>
+      <w:proofErr w:type="gramEnd"/>
+      <w:r>
+        <w:t xml:space="preserve"> deployment token at the top of the page and then copy the deployment token.</w:t>
+      </w:r>
+    </w:p>
+    <w:p>
+      <w:pPr>
+        <w:pStyle w:val="ListParagraph"/>
+        <w:numPr>
+          <w:ilvl w:val="0"/>
+          <w:numId w:val="38"/>
+        </w:numPr>
+      </w:pPr>
+      <w:r>
+        <w:t xml:space="preserve">Go to </w:t>
+      </w:r>
+      <w:proofErr w:type="gramStart"/>
+      <w:r>
+        <w:t>The</w:t>
+      </w:r>
+      <w:proofErr w:type="gramEnd"/>
+      <w:r>
+        <w:t xml:space="preserve"> gitlab repository for the project and then go to settings &gt; CI/CD &gt; Variables</w:t>
+      </w:r>
+    </w:p>
+    <w:p>
+      <w:pPr>
+        <w:pStyle w:val="ListParagraph"/>
+        <w:numPr>
+          <w:ilvl w:val="0"/>
+          <w:numId w:val="38"/>
+        </w:numPr>
+      </w:pPr>
+      <w:r>
+        <w:t xml:space="preserve">Set the key as </w:t>
+      </w:r>
+      <w:r>
+        <w:t>AZURE_STATIC_WEB_APPS_API_TOKEN</w:t>
+      </w:r>
+      <w:r>
+        <w:t xml:space="preserve"> and then paste the token into the value field</w:t>
+      </w:r>
+    </w:p>
+    <w:p>
+      <w:pPr>
+        <w:ind w:left="720" w:firstLine="0"/>
+      </w:pPr>
+      <w:r>
+        <w:drawing>
+          <wp:inline distT="0" distB="0" distL="0" distR="0" wp14:anchorId="14CC4739" wp14:editId="7BD50296">
+            <wp:extent cx="5943600" cy="3415030"/>
+            <wp:effectExtent l="0" t="0" r="0" b="0"/>
+            <wp:docPr id="876598561" name="Picture 1"/>
+            <wp:cNvGraphicFramePr>
+              <a:graphicFrameLocks xmlns:a="http://schemas.openxmlformats.org/drawingml/2006/main" noChangeAspect="1"/>
+            </wp:cNvGraphicFramePr>
+            <a:graphic xmlns:a="http://schemas.openxmlformats.org/drawingml/2006/main">
+              <a:graphicData uri="http://schemas.openxmlformats.org/drawingml/2006/picture">
+                <pic:pic xmlns:pic="http://schemas.openxmlformats.org/drawingml/2006/picture">
+                  <pic:nvPicPr>
+                    <pic:cNvPr id="547473780" name=""/>
+                    <pic:cNvPicPr/>
+                  </pic:nvPicPr>
+                  <pic:blipFill>
+                    <a:blip r:embed="rId38"/>
+                    <a:stretch>
+                      <a:fillRect/>
+                    </a:stretch>
+                  </pic:blipFill>
+                  <pic:spPr>
+                    <a:xfrm>
+                      <a:off x="0" y="0"/>
+                      <a:ext cx="5943600" cy="3415030"/>
+                    </a:xfrm>
+                    <a:prstGeom prst="rect">
+                      <a:avLst/>
+                    </a:prstGeom>
+                  </pic:spPr>
+                </pic:pic>
+              </a:graphicData>
+            </a:graphic>
+          </wp:inline>
+        </w:drawing>
+      </w:r>
+    </w:p>
+    <w:p>
+      <w:pPr>
+        <w:pStyle w:val="ListParagraph"/>
+        <w:numPr>
+          <w:ilvl w:val="0"/>
+          <w:numId w:val="38"/>
+        </w:numPr>
+      </w:pPr>
+      <w:r>
+        <w:t xml:space="preserve">Hit </w:t>
+      </w:r>
+      <w:proofErr w:type="gramStart"/>
+      <w:r>
+        <w:t>save</w:t>
+      </w:r>
+      <w:proofErr w:type="gramEnd"/>
+      <w:r>
+        <w:t>.</w:t>
+      </w:r>
+    </w:p>
+    <w:p>
+      <w:pPr>
+        <w:pStyle w:val="ListParagraph"/>
+        <w:numPr>
+          <w:ilvl w:val="0"/>
+          <w:numId w:val="38"/>
+        </w:numPr>
+      </w:pPr>
+      <w:r>
+        <w:t xml:space="preserve">Create a </w:t>
+      </w:r>
+      <w:proofErr w:type="gramStart"/>
+      <w:r>
+        <w:t>“.</w:t>
+      </w:r>
+      <w:r>
+        <w:t>gitlab-ci.yml</w:t>
+      </w:r>
+      <w:proofErr w:type="gramEnd"/>
+      <w:r>
+        <w:t>” file in the repository root. – this will allow gitlab to connect to azure and automatically deploy the application.</w:t>
+      </w:r>
+    </w:p>
+    <w:p>
+      <w:pPr>
+        <w:pStyle w:val="ListParagraph"/>
+        <w:numPr>
+          <w:ilvl w:val="0"/>
+          <w:numId w:val="38"/>
+        </w:numPr>
+      </w:pPr>
+      <w:r>
+        <w:t xml:space="preserve">Create the yml file </w:t>
+      </w:r>
+    </w:p>
+    <w:p>
+      <w:pPr>
+        <w:pStyle w:val="ListParagraph"/>
+        <w:numPr>
+          <w:ilvl w:val="1"/>
+          <w:numId w:val="38"/>
+        </w:numPr>
+      </w:pPr>
+      <w:r>
+        <w:t>Example YML file is in the root of the Gitlab Repository</w:t>
+      </w:r>
+    </w:p>
+    <w:p>
+      <w:pPr>
+        <w:pStyle w:val="ListParagraph"/>
+        <w:numPr>
+          <w:ilvl w:val="1"/>
+          <w:numId w:val="38"/>
+        </w:numPr>
+      </w:pPr>
+      <w:r>
         <w:t>Add “</w:t>
       </w:r>
       <w:r>
-        <w:t>--env production</w:t>
-      </w:r>
-      <w:r>
-        <w:t>”  to the end of the line with the swa deploy command to deploy the app to production</w:t>
-      </w:r>
+        <w:t xml:space="preserve">--env </w:t>
+      </w:r>
+      <w:proofErr w:type="gramStart"/>
+      <w:r>
+        <w:t>production</w:t>
+      </w:r>
+      <w:r>
+        <w:t>”  to</w:t>
+      </w:r>
+      <w:proofErr w:type="gramEnd"/>
+      <w:r>
+        <w:t xml:space="preserve"> the end of the line with the swa deploy command to deploy the app to production or remove it to deploy the app to a preview url</w:t>
+      </w:r>
+    </w:p>
+    <w:p>
+      <w:pPr>
+        <w:pStyle w:val="ListParagraph"/>
+        <w:numPr>
+          <w:ilvl w:val="0"/>
+          <w:numId w:val="38"/>
+        </w:numPr>
+      </w:pPr>
+      <w:r>
+        <w:t>Add, Commit, and Push the repository with the YML file.</w:t>
+      </w:r>
+    </w:p>
+    <w:p>
+      <w:pPr>
+        <w:pStyle w:val="ListParagraph"/>
+        <w:numPr>
+          <w:ilvl w:val="0"/>
+          <w:numId w:val="38"/>
+        </w:numPr>
+      </w:pPr>
+      <w:proofErr w:type="gramStart"/>
+      <w:r>
+        <w:lastRenderedPageBreak/>
+        <w:t>Watch on</w:t>
+      </w:r>
+      <w:proofErr w:type="gramEnd"/>
+      <w:r>
+        <w:t xml:space="preserve"> the GitLab pipelines page to ensure that the application is deployed to azure successfully.</w:t>
+      </w:r>
+    </w:p>
+    <w:p>
+      <w:pPr>
+        <w:pStyle w:val="ListParagraph"/>
+        <w:numPr>
+          <w:ilvl w:val="0"/>
+          <w:numId w:val="38"/>
+        </w:numPr>
+      </w:pPr>
+      <w:r>
+        <w:t xml:space="preserve">Open the </w:t>
+      </w:r>
+      <w:proofErr w:type="gramStart"/>
+      <w:r>
+        <w:t>front end</w:t>
+      </w:r>
+      <w:proofErr w:type="gramEnd"/>
+      <w:r>
+        <w:t xml:space="preserve"> website. The URL can be found on the azure website for the web app that you created in step 10</w:t>
+      </w:r>
+    </w:p>
+    <w:p>
+      <w:pPr>
+        <w:pStyle w:val="ListParagraph"/>
+        <w:ind w:left="1080"/>
+      </w:pPr>
+    </w:p>
+    <w:p>
+      <w:pPr>
+        <w:pStyle w:val="ListParagraph"/>
+        <w:ind w:left="1080"/>
+      </w:pPr>
     </w:p>
     <w:sectPr>
-      <w:headerReference w:type="default" r:id="rId38"/>
-      <w:headerReference w:type="first" r:id="rId39"/>
+      <w:headerReference w:type="default" r:id="rId41"/>
+      <w:headerReference w:type="first" r:id="rId42"/>
       <w:footnotePr>
         <w:pos w:val="beneathText"/>
       </w:footnotePr>
@@ -7213,7 +8125,7 @@
         <w:ind w:left="1800" w:hanging="360"/>
       </w:pPr>
     </w:lvl>
-    <w:lvl w:ilvl="2" w:tplc="0409001B" w:tentative="1">
+    <w:lvl w:ilvl="2" w:tplc="0409001B">
       <w:start w:val="1"/>
       <w:numFmt w:val="lowerRoman"/>
       <w:lvlText w:val="%3."/>
@@ -8584,6 +9496,95 @@
     </w:lvl>
   </w:abstractNum>
   <w:abstractNum w:abstractNumId="31" w15:restartNumberingAfterBreak="0">
+    <w:nsid w:val="6F5D0786"/>
+    <w:multiLevelType w:val="hybridMultilevel"/>
+    <w:tmpl w:val="00368E44"/>
+    <w:lvl w:ilvl="0" w:tplc="5E36905C">
+      <w:start w:val="1"/>
+      <w:numFmt w:val="decimal"/>
+      <w:lvlText w:val="%1."/>
+      <w:lvlJc w:val="left"/>
+      <w:pPr>
+        <w:ind w:left="720" w:hanging="360"/>
+      </w:pPr>
+      <w:rPr>
+        <w:rFonts w:asciiTheme="minorHAnsi" w:eastAsiaTheme="minorEastAsia" w:hAnsiTheme="minorHAnsi" w:cstheme="minorBidi"/>
+      </w:rPr>
+    </w:lvl>
+    <w:lvl w:ilvl="1" w:tplc="04090019">
+      <w:start w:val="1"/>
+      <w:numFmt w:val="lowerLetter"/>
+      <w:lvlText w:val="%2."/>
+      <w:lvlJc w:val="left"/>
+      <w:pPr>
+        <w:ind w:left="1440" w:hanging="360"/>
+      </w:pPr>
+    </w:lvl>
+    <w:lvl w:ilvl="2" w:tplc="0409001B" w:tentative="1">
+      <w:start w:val="1"/>
+      <w:numFmt w:val="lowerRoman"/>
+      <w:lvlText w:val="%3."/>
+      <w:lvlJc w:val="right"/>
+      <w:pPr>
+        <w:ind w:left="2160" w:hanging="180"/>
+      </w:pPr>
+    </w:lvl>
+    <w:lvl w:ilvl="3" w:tplc="0409000F" w:tentative="1">
+      <w:start w:val="1"/>
+      <w:numFmt w:val="decimal"/>
+      <w:lvlText w:val="%4."/>
+      <w:lvlJc w:val="left"/>
+      <w:pPr>
+        <w:ind w:left="2880" w:hanging="360"/>
+      </w:pPr>
+    </w:lvl>
+    <w:lvl w:ilvl="4" w:tplc="04090019" w:tentative="1">
+      <w:start w:val="1"/>
+      <w:numFmt w:val="lowerLetter"/>
+      <w:lvlText w:val="%5."/>
+      <w:lvlJc w:val="left"/>
+      <w:pPr>
+        <w:ind w:left="3600" w:hanging="360"/>
+      </w:pPr>
+    </w:lvl>
+    <w:lvl w:ilvl="5" w:tplc="0409001B" w:tentative="1">
+      <w:start w:val="1"/>
+      <w:numFmt w:val="lowerRoman"/>
+      <w:lvlText w:val="%6."/>
+      <w:lvlJc w:val="right"/>
+      <w:pPr>
+        <w:ind w:left="4320" w:hanging="180"/>
+      </w:pPr>
+    </w:lvl>
+    <w:lvl w:ilvl="6" w:tplc="0409000F" w:tentative="1">
+      <w:start w:val="1"/>
+      <w:numFmt w:val="decimal"/>
+      <w:lvlText w:val="%7."/>
+      <w:lvlJc w:val="left"/>
+      <w:pPr>
+        <w:ind w:left="5040" w:hanging="360"/>
+      </w:pPr>
+    </w:lvl>
+    <w:lvl w:ilvl="7" w:tplc="04090019" w:tentative="1">
+      <w:start w:val="1"/>
+      <w:numFmt w:val="lowerLetter"/>
+      <w:lvlText w:val="%8."/>
+      <w:lvlJc w:val="left"/>
+      <w:pPr>
+        <w:ind w:left="5760" w:hanging="360"/>
+      </w:pPr>
+    </w:lvl>
+    <w:lvl w:ilvl="8" w:tplc="0409001B" w:tentative="1">
+      <w:start w:val="1"/>
+      <w:numFmt w:val="lowerRoman"/>
+      <w:lvlText w:val="%9."/>
+      <w:lvlJc w:val="right"/>
+      <w:pPr>
+        <w:ind w:left="6480" w:hanging="180"/>
+      </w:pPr>
+    </w:lvl>
+  </w:abstractNum>
+  <w:abstractNum w:abstractNumId="32" w15:restartNumberingAfterBreak="0">
     <w:nsid w:val="7273740B"/>
     <w:multiLevelType w:val="multilevel"/>
     <w:tmpl w:val="0409001F"/>
@@ -8669,7 +9670,7 @@
       </w:pPr>
     </w:lvl>
   </w:abstractNum>
-  <w:abstractNum w:abstractNumId="32" w15:restartNumberingAfterBreak="0">
+  <w:abstractNum w:abstractNumId="33" w15:restartNumberingAfterBreak="0">
     <w:nsid w:val="73677582"/>
     <w:multiLevelType w:val="hybridMultilevel"/>
     <w:tmpl w:val="BC9EA742"/>
@@ -8758,7 +9759,7 @@
       </w:pPr>
     </w:lvl>
   </w:abstractNum>
-  <w:abstractNum w:abstractNumId="33" w15:restartNumberingAfterBreak="0">
+  <w:abstractNum w:abstractNumId="34" w15:restartNumberingAfterBreak="0">
     <w:nsid w:val="78E4145D"/>
     <w:multiLevelType w:val="hybridMultilevel"/>
     <w:tmpl w:val="7F80F2D4"/>
@@ -8847,7 +9848,7 @@
       </w:pPr>
     </w:lvl>
   </w:abstractNum>
-  <w:abstractNum w:abstractNumId="34" w15:restartNumberingAfterBreak="0">
+  <w:abstractNum w:abstractNumId="35" w15:restartNumberingAfterBreak="0">
     <w:nsid w:val="793B28D3"/>
     <w:multiLevelType w:val="hybridMultilevel"/>
     <w:tmpl w:val="B04CFF14"/>
@@ -8960,7 +9961,7 @@
       </w:rPr>
     </w:lvl>
   </w:abstractNum>
-  <w:abstractNum w:abstractNumId="35" w15:restartNumberingAfterBreak="0">
+  <w:abstractNum w:abstractNumId="36" w15:restartNumberingAfterBreak="0">
     <w:nsid w:val="7F117559"/>
     <w:multiLevelType w:val="hybridMultilevel"/>
     <w:tmpl w:val="63C86556"/>
@@ -9086,7 +10087,7 @@
     </w:lvlOverride>
   </w:num>
   <w:num w:numId="12" w16cid:durableId="1327175495">
-    <w:abstractNumId w:val="31"/>
+    <w:abstractNumId w:val="32"/>
   </w:num>
   <w:num w:numId="13" w16cid:durableId="246960533">
     <w:abstractNumId w:val="26"/>
@@ -9122,10 +10123,10 @@
     <w:abstractNumId w:val="29"/>
   </w:num>
   <w:num w:numId="24" w16cid:durableId="1293904994">
-    <w:abstractNumId w:val="35"/>
+    <w:abstractNumId w:val="36"/>
   </w:num>
   <w:num w:numId="25" w16cid:durableId="1788036399">
-    <w:abstractNumId w:val="33"/>
+    <w:abstractNumId w:val="34"/>
   </w:num>
   <w:num w:numId="26" w16cid:durableId="1722706504">
     <w:abstractNumId w:val="28"/>
@@ -9134,7 +10135,7 @@
     <w:abstractNumId w:val="12"/>
   </w:num>
   <w:num w:numId="28" w16cid:durableId="1691569864">
-    <w:abstractNumId w:val="32"/>
+    <w:abstractNumId w:val="33"/>
   </w:num>
   <w:num w:numId="29" w16cid:durableId="2098944457">
     <w:abstractNumId w:val="23"/>
@@ -9158,10 +10159,13 @@
     <w:abstractNumId w:val="19"/>
   </w:num>
   <w:num w:numId="36" w16cid:durableId="1249847265">
-    <w:abstractNumId w:val="34"/>
+    <w:abstractNumId w:val="35"/>
   </w:num>
   <w:num w:numId="37" w16cid:durableId="1430546522">
     <w:abstractNumId w:val="16"/>
+  </w:num>
+  <w:num w:numId="38" w16cid:durableId="667943793">
+    <w:abstractNumId w:val="31"/>
   </w:num>
 </w:numbering>
 </file>
@@ -9561,7 +10565,7 @@
   <w:style w:type="paragraph" w:default="1" w:styleId="Normal">
     <w:name w:val="Normal"/>
     <w:qFormat/>
-    <w:rsid w:val="00165350"/>
+    <w:rsid w:val="001464E7"/>
     <w:rPr>
       <w:kern w:val="24"/>
     </w:rPr>

</xml_diff>

<commit_message>
Fixed the back end database location and environment variable setup
</commit_message>
<xml_diff>
--- a/documentation/task3.docx
+++ b/documentation/task3.docx
@@ -2543,21 +2543,11 @@
       <w:r>
         <w:t xml:space="preserve">facilitates a many to Many </w:t>
       </w:r>
-      <w:proofErr w:type="gramStart"/>
       <w:r>
         <w:t>relationship</w:t>
       </w:r>
-      <w:proofErr w:type="gramEnd"/>
-      <w:r>
-        <w:t xml:space="preserve"> between User and Media. The UserMedia class holds information that is specific to a </w:t>
-      </w:r>
-      <w:proofErr w:type="gramStart"/>
-      <w:r>
-        <w:t>users</w:t>
-      </w:r>
-      <w:proofErr w:type="gramEnd"/>
-      <w:r>
-        <w:t xml:space="preserve"> relationship to a piece of media. For </w:t>
+      <w:r>
+        <w:t xml:space="preserve"> between User and Media. The UserMedia class holds information that is specific to a users relationship to a piece of media. For </w:t>
       </w:r>
       <w:r>
         <w:t>example,</w:t>
@@ -2669,15 +2659,7 @@
     </w:p>
     <w:p>
       <w:r>
-        <w:t xml:space="preserve">Shown below are various UI wireframes created early in development. On the left the </w:t>
-      </w:r>
-      <w:proofErr w:type="gramStart"/>
-      <w:r>
-        <w:t>Home</w:t>
-      </w:r>
-      <w:proofErr w:type="gramEnd"/>
-      <w:r>
-        <w:t xml:space="preserve"> screen is shown, and on the right the “Add Media” page and “Media View” page are shown. These wireframes show the main pages of the apps. Many additional fields have been added as additional features and fields have been required.</w:t>
+        <w:t>Shown below are various UI wireframes created early in development. On the left the Home screen is shown, and on the right the “Add Media” page and “Media View” page are shown. These wireframes show the main pages of the apps. Many additional fields have been added as additional features and fields have been required.</w:t>
       </w:r>
     </w:p>
     <w:p>
@@ -3194,15 +3176,7 @@
         <w:t>Various Testing methods will be utilized to ensure that the application functions as desired. xUnit will be used to perform Unit Testing. Postman will be used to perform integration testing and API Testing. End to end Testing will be done manually. These tests will be used to ensure that individual units, API endpoints, and application features all behave as expected.</w:t>
       </w:r>
       <w:r>
-        <w:t xml:space="preserve"> When tests </w:t>
-      </w:r>
-      <w:proofErr w:type="gramStart"/>
-      <w:r>
-        <w:t>are failed</w:t>
-      </w:r>
-      <w:proofErr w:type="gramEnd"/>
-      <w:r>
-        <w:t>, root cause analysis will take place, and the root of the issue will be fixed.</w:t>
+        <w:t xml:space="preserve"> When tests are failed, root cause analysis will take place, and the root of the issue will be fixed.</w:t>
       </w:r>
     </w:p>
     <w:p>
@@ -3393,15 +3367,7 @@
         </w:numPr>
       </w:pPr>
       <w:r>
-        <w:t xml:space="preserve">A Testing Framework will be needed so the tests can be composed and </w:t>
-      </w:r>
-      <w:proofErr w:type="gramStart"/>
-      <w:r>
-        <w:t>Run</w:t>
-      </w:r>
-      <w:proofErr w:type="gramEnd"/>
-      <w:r>
-        <w:t>. xUnit has been used for these unit tests.</w:t>
+        <w:t>A Testing Framework will be needed so the tests can be composed and Run. xUnit has been used for these unit tests.</w:t>
       </w:r>
     </w:p>
     <w:p>
@@ -3501,15 +3467,7 @@
         </w:numPr>
       </w:pPr>
       <w:r>
-        <w:t xml:space="preserve">Each Test will produce test results. These results will be automatically produced by the testing </w:t>
-      </w:r>
-      <w:proofErr w:type="gramStart"/>
-      <w:r>
-        <w:t>frame work</w:t>
-      </w:r>
-      <w:proofErr w:type="gramEnd"/>
-      <w:r>
-        <w:t xml:space="preserve"> and will show the result of each test.</w:t>
+        <w:t>Each Test will produce test results. These results will be automatically produced by the testing frame work and will show the result of each test.</w:t>
       </w:r>
       <w:r>
         <w:t xml:space="preserve"> </w:t>
@@ -3563,13 +3521,8 @@
         </w:numPr>
       </w:pPr>
       <w:r>
-        <w:t xml:space="preserve">Dependency Injection must be manually set up for proper testing of the authentication service as it is heavily used within the application due to its use of </w:t>
-      </w:r>
-      <w:proofErr w:type="gramStart"/>
-      <w:r>
-        <w:t>ASP.net .</w:t>
-      </w:r>
-      <w:proofErr w:type="gramEnd"/>
+        <w:t>Dependency Injection must be manually set up for proper testing of the authentication service as it is heavily used within the application due to its use of ASP.net .</w:t>
+      </w:r>
     </w:p>
     <w:p>
       <w:pPr>
@@ -3583,15 +3536,7 @@
         <w:t xml:space="preserve">The Database must be configured within as the application uses an SQLite Database. The database will be set up as </w:t>
       </w:r>
       <w:r>
-        <w:t xml:space="preserve">an </w:t>
-      </w:r>
-      <w:proofErr w:type="gramStart"/>
-      <w:r>
-        <w:t>in memory</w:t>
-      </w:r>
-      <w:proofErr w:type="gramEnd"/>
-      <w:r>
-        <w:t xml:space="preserve"> database, which will be completely fresh for each test.</w:t>
+        <w:t>an in memory database, which will be completely fresh for each test.</w:t>
       </w:r>
     </w:p>
     <w:p>
@@ -3698,13 +3643,8 @@
       <w:bookmarkEnd w:id="27"/>
     </w:p>
     <w:p>
-      <w:proofErr w:type="gramStart"/>
-      <w:r>
-        <w:t>Register</w:t>
-      </w:r>
-      <w:proofErr w:type="gramEnd"/>
-      <w:r>
-        <w:t xml:space="preserve"> a new User</w:t>
+      <w:r>
+        <w:t>Register a new User</w:t>
       </w:r>
     </w:p>
     <w:p>
@@ -3766,13 +3706,8 @@
           <w:numId w:val="36"/>
         </w:numPr>
       </w:pPr>
-      <w:proofErr w:type="gramStart"/>
-      <w:r>
-        <w:t>Fail</w:t>
-      </w:r>
-      <w:proofErr w:type="gramEnd"/>
-      <w:r>
-        <w:t>:</w:t>
+      <w:r>
+        <w:t>Fail:</w:t>
       </w:r>
       <w:r>
         <w:tab/>
@@ -3832,14 +3767,9 @@
       </w:r>
     </w:p>
     <w:p>
-      <w:proofErr w:type="gramStart"/>
       <w:r>
         <w:lastRenderedPageBreak/>
-        <w:t>Register</w:t>
-      </w:r>
-      <w:proofErr w:type="gramEnd"/>
-      <w:r>
-        <w:t xml:space="preserve"> a new User</w:t>
+        <w:t>Register a new User</w:t>
       </w:r>
     </w:p>
     <w:p>
@@ -3901,13 +3831,8 @@
           <w:numId w:val="36"/>
         </w:numPr>
       </w:pPr>
-      <w:proofErr w:type="gramStart"/>
-      <w:r>
-        <w:t>Fail</w:t>
-      </w:r>
-      <w:proofErr w:type="gramEnd"/>
-      <w:r>
-        <w:t>:</w:t>
+      <w:r>
+        <w:t>Fail:</w:t>
       </w:r>
       <w:r>
         <w:tab/>
@@ -4001,13 +3926,8 @@
           <w:numId w:val="36"/>
         </w:numPr>
       </w:pPr>
-      <w:proofErr w:type="gramStart"/>
-      <w:r>
-        <w:t>Fail</w:t>
-      </w:r>
-      <w:proofErr w:type="gramEnd"/>
-      <w:r>
-        <w:t>:</w:t>
+      <w:r>
+        <w:t>Fail:</w:t>
       </w:r>
       <w:r>
         <w:tab/>
@@ -4129,13 +4049,8 @@
           <w:numId w:val="36"/>
         </w:numPr>
       </w:pPr>
-      <w:proofErr w:type="gramStart"/>
-      <w:r>
-        <w:t>Fail</w:t>
-      </w:r>
-      <w:proofErr w:type="gramEnd"/>
-      <w:r>
-        <w:t>:</w:t>
+      <w:r>
+        <w:t>Fail:</w:t>
       </w:r>
       <w:r>
         <w:tab/>
@@ -4294,13 +4209,8 @@
           <w:numId w:val="36"/>
         </w:numPr>
       </w:pPr>
-      <w:proofErr w:type="gramStart"/>
-      <w:r>
-        <w:t>Fail</w:t>
-      </w:r>
-      <w:proofErr w:type="gramEnd"/>
-      <w:r>
-        <w:t>:</w:t>
+      <w:r>
+        <w:t>Fail:</w:t>
       </w:r>
       <w:r>
         <w:tab/>
@@ -4419,15 +4329,7 @@
         <w:t>The AuthResponse object contains errors in its error list</w:t>
       </w:r>
       <w:r>
-        <w:t xml:space="preserve"> (The message that is returned can vary depending on what part of the password requirements the password does not </w:t>
-      </w:r>
-      <w:proofErr w:type="gramStart"/>
-      <w:r>
-        <w:t>meet,</w:t>
-      </w:r>
-      <w:proofErr w:type="gramEnd"/>
-      <w:r>
-        <w:t xml:space="preserve"> therefore, the message contents are not checked)</w:t>
+        <w:t xml:space="preserve"> (The message that is returned can vary depending on what part of the password requirements the password does not meet, therefore, the message contents are not checked)</w:t>
       </w:r>
     </w:p>
     <w:p>
@@ -4438,14 +4340,9 @@
           <w:numId w:val="36"/>
         </w:numPr>
       </w:pPr>
-      <w:proofErr w:type="gramStart"/>
       <w:r>
         <w:lastRenderedPageBreak/>
-        <w:t>Fail</w:t>
-      </w:r>
-      <w:proofErr w:type="gramEnd"/>
-      <w:r>
-        <w:t>:</w:t>
+        <w:t>Fail:</w:t>
       </w:r>
       <w:r>
         <w:tab/>
@@ -5019,23 +4916,7 @@
         <w:t>BadPassword</w:t>
       </w:r>
       <w:r>
-        <w:t xml:space="preserve"> – This test is to ensure that an account creation with a “bad password” or a password that does not meet the password requirements </w:t>
-      </w:r>
-      <w:proofErr w:type="gramStart"/>
-      <w:r>
-        <w:t>does not succeed</w:t>
-      </w:r>
-      <w:proofErr w:type="gramEnd"/>
-      <w:r>
-        <w:t xml:space="preserve">. This Test passed, as an AuthResponse object was returned to the caller. The AuthResponse object did not contain any authentication </w:t>
-      </w:r>
-      <w:proofErr w:type="gramStart"/>
-      <w:r>
-        <w:t>Token, but</w:t>
-      </w:r>
-      <w:proofErr w:type="gramEnd"/>
-      <w:r>
-        <w:t xml:space="preserve"> did contain </w:t>
+        <w:t xml:space="preserve"> – This test is to ensure that an account creation with a “bad password” or a password that does not meet the password requirements does not succeed. This Test passed, as an AuthResponse object was returned to the caller. The AuthResponse object did not contain any authentication Token, but did contain </w:t>
       </w:r>
       <w:r>
         <w:t>errors in the object’s error list.</w:t>
@@ -5065,24 +4946,11 @@
       <w:r>
         <w:t xml:space="preserve"> password </w:t>
       </w:r>
-      <w:proofErr w:type="gramStart"/>
       <w:r>
         <w:t xml:space="preserve">does </w:t>
       </w:r>
       <w:r>
-        <w:t>not succeed</w:t>
-      </w:r>
-      <w:proofErr w:type="gramEnd"/>
-      <w:r>
-        <w:t xml:space="preserve">. This Test passed, as an AuthResponse object was returned to the caller. The AuthResponse object did not contain any authentication </w:t>
-      </w:r>
-      <w:proofErr w:type="gramStart"/>
-      <w:r>
-        <w:t>Token, but</w:t>
-      </w:r>
-      <w:proofErr w:type="gramEnd"/>
-      <w:r>
-        <w:t xml:space="preserve"> did contain errors in the object’s error list.</w:t>
+        <w:t>not succeed. This Test passed, as an AuthResponse object was returned to the caller. The AuthResponse object did not contain any authentication Token, but did contain errors in the object’s error list.</w:t>
       </w:r>
     </w:p>
     <w:p>
@@ -5090,15 +4958,7 @@
         <w:t>DuplicateEmail</w:t>
       </w:r>
       <w:r>
-        <w:t xml:space="preserve"> – This test is to ensure that an account cannot be created that has the same email address as another account. This test passed, as an AuthResponse object was returned to the caller. The AuthResponse object did not have an authorization </w:t>
-      </w:r>
-      <w:proofErr w:type="gramStart"/>
-      <w:r>
-        <w:t>token, but</w:t>
-      </w:r>
-      <w:proofErr w:type="gramEnd"/>
-      <w:r>
-        <w:t xml:space="preserve"> did contain the necessary error notifying the caller of an email conflict.</w:t>
+        <w:t xml:space="preserve"> – This test is to ensure that an account cannot be created that has the same email address as another account. This test passed, as an AuthResponse object was returned to the caller. The AuthResponse object did not have an authorization token, but did contain the necessary error notifying the caller of an email conflict.</w:t>
       </w:r>
     </w:p>
     <w:p>
@@ -5115,15 +4975,7 @@
         <w:t>username</w:t>
       </w:r>
       <w:r>
-        <w:t xml:space="preserve"> as another account. This test passed, as an AuthResponse object was returned to the caller. The AuthResponse object did not have an authorization </w:t>
-      </w:r>
-      <w:proofErr w:type="gramStart"/>
-      <w:r>
-        <w:t>token, but</w:t>
-      </w:r>
-      <w:proofErr w:type="gramEnd"/>
-      <w:r>
-        <w:t xml:space="preserve"> did contain the necessary error notifying the caller of a</w:t>
+        <w:t xml:space="preserve"> as another account. This test passed, as an AuthResponse object was returned to the caller. The AuthResponse object did not have an authorization token, but did contain the necessary error notifying the caller of a</w:t>
       </w:r>
       <w:r>
         <w:t xml:space="preserve"> username </w:t>
@@ -5152,15 +5004,7 @@
         <w:t xml:space="preserve">This test is to ensure that </w:t>
       </w:r>
       <w:r>
-        <w:t xml:space="preserve">a user </w:t>
-      </w:r>
-      <w:proofErr w:type="gramStart"/>
-      <w:r>
-        <w:t>is able to</w:t>
-      </w:r>
-      <w:proofErr w:type="gramEnd"/>
-      <w:r>
-        <w:t xml:space="preserve"> log in with proper credentials as </w:t>
+        <w:t xml:space="preserve">a user is able to log in with proper credentials as </w:t>
       </w:r>
       <w:r>
         <w:t>expected and receive an authorization token. The test passed as the method returned an AuthResponse object that contained the proper authorization token and did not contain any errors in the objects error list.</w:t>
@@ -5283,15 +5127,7 @@
         <w:t xml:space="preserve">include </w:t>
       </w:r>
       <w:r>
-        <w:t xml:space="preserve">how to install, log into, sign up, and use </w:t>
-      </w:r>
-      <w:proofErr w:type="gramStart"/>
-      <w:r>
-        <w:t>all of</w:t>
-      </w:r>
-      <w:proofErr w:type="gramEnd"/>
-      <w:r>
-        <w:t xml:space="preserve"> the functions of the application. </w:t>
+        <w:t xml:space="preserve">how to install, log into, sign up, and use all of the functions of the application. </w:t>
       </w:r>
       <w:r>
         <w:t>The steps need to be clearly defined and fully tested so the process works flawlessly for the evaluator.</w:t>
@@ -5314,15 +5150,7 @@
     </w:p>
     <w:p>
       <w:r>
-        <w:t xml:space="preserve">This procedural information should follow the basic rules of such technical references. While some procedures may provide for personal </w:t>
-      </w:r>
-      <w:proofErr w:type="gramStart"/>
-      <w:r>
-        <w:t>judgment</w:t>
-      </w:r>
-      <w:proofErr w:type="gramEnd"/>
-      <w:r>
-        <w:t xml:space="preserve"> your</w:t>
+        <w:t>This procedural information should follow the basic rules of such technical references. While some procedures may provide for personal judgment your</w:t>
       </w:r>
       <w:r>
         <w:t>s</w:t>
@@ -5364,15 +5192,7 @@
         </w:numPr>
       </w:pPr>
       <w:r>
-        <w:t xml:space="preserve">Provide visual </w:t>
-      </w:r>
-      <w:proofErr w:type="gramStart"/>
-      <w:r>
-        <w:t>stepping stones</w:t>
-      </w:r>
-      <w:proofErr w:type="gramEnd"/>
-      <w:r>
-        <w:t xml:space="preserve"> by using bullets or labeling steps. </w:t>
+        <w:t xml:space="preserve">Provide visual stepping stones by using bullets or labeling steps. </w:t>
       </w:r>
     </w:p>
     <w:p>
@@ -5579,21 +5399,7 @@
         <w:rPr>
           <w:i/>
         </w:rPr>
-        <w:t xml:space="preserve"> </w:t>
-      </w:r>
-      <w:proofErr w:type="gramStart"/>
-      <w:r>
-        <w:rPr>
-          <w:i/>
-        </w:rPr>
-        <w:t>that states</w:t>
-      </w:r>
-      <w:proofErr w:type="gramEnd"/>
-      <w:r>
-        <w:rPr>
-          <w:i/>
-        </w:rPr>
-        <w:t xml:space="preserve"> “Need an account?”</w:t>
+        <w:t xml:space="preserve"> that states “Need an account?”</w:t>
       </w:r>
     </w:p>
     <w:p>
@@ -5647,19 +5453,11 @@
       </w:pPr>
       <w:bookmarkStart w:id="42" w:name="_Toc233458552"/>
       <w:bookmarkStart w:id="43" w:name="_Toc233463919"/>
-      <w:proofErr w:type="gramStart"/>
       <w:r>
         <w:rPr>
           <w:i/>
         </w:rPr>
-        <w:t>Create</w:t>
-      </w:r>
-      <w:proofErr w:type="gramEnd"/>
-      <w:r>
-        <w:rPr>
-          <w:i/>
-        </w:rPr>
-        <w:t xml:space="preserve"> a New Class</w:t>
+        <w:t>Create a New Class</w:t>
       </w:r>
       <w:bookmarkEnd w:id="42"/>
       <w:bookmarkEnd w:id="43"/>
@@ -5829,21 +5627,7 @@
         <w:rPr>
           <w:i/>
         </w:rPr>
-        <w:t xml:space="preserve">Enter </w:t>
-      </w:r>
-      <w:proofErr w:type="gramStart"/>
-      <w:r>
-        <w:rPr>
-          <w:i/>
-        </w:rPr>
-        <w:t>a class</w:t>
-      </w:r>
-      <w:proofErr w:type="gramEnd"/>
-      <w:r>
-        <w:rPr>
-          <w:i/>
-        </w:rPr>
-        <w:t xml:space="preserve"> name and its description. The class name must be unique.</w:t>
+        <w:t>Enter a class name and its description. The class name must be unique.</w:t>
       </w:r>
     </w:p>
     <w:p>
@@ -6402,15 +6186,7 @@
         </w:numPr>
       </w:pPr>
       <w:r>
-        <w:t xml:space="preserve">Click </w:t>
-      </w:r>
-      <w:proofErr w:type="gramStart"/>
-      <w:r>
-        <w:t>manage</w:t>
-      </w:r>
-      <w:proofErr w:type="gramEnd"/>
-      <w:r>
-        <w:t xml:space="preserve"> deployment token at the top of the page and then copy the deployment token.</w:t>
+        <w:t>Click manage deployment token at the top of the page and then copy the deployment token.</w:t>
       </w:r>
     </w:p>
     <w:p>
@@ -6423,15 +6199,7 @@
       </w:pPr>
       <w:r>
         <w:lastRenderedPageBreak/>
-        <w:t xml:space="preserve">Go to </w:t>
-      </w:r>
-      <w:proofErr w:type="gramStart"/>
-      <w:r>
-        <w:t>The</w:t>
-      </w:r>
-      <w:proofErr w:type="gramEnd"/>
-      <w:r>
-        <w:t xml:space="preserve"> gitlab repository for the project and then go to settings &gt; </w:t>
+        <w:t xml:space="preserve">Go to The gitlab repository for the project and then go to settings &gt; </w:t>
       </w:r>
       <w:r>
         <w:t>CI/CD &gt; Variables</w:t>
@@ -6506,15 +6274,7 @@
         </w:numPr>
       </w:pPr>
       <w:r>
-        <w:t xml:space="preserve">Hit </w:t>
-      </w:r>
-      <w:proofErr w:type="gramStart"/>
-      <w:r>
-        <w:t>save</w:t>
-      </w:r>
-      <w:proofErr w:type="gramEnd"/>
-      <w:r>
-        <w:t>.</w:t>
+        <w:t>Hit save.</w:t>
       </w:r>
     </w:p>
     <w:p>
@@ -6528,14 +6288,12 @@
       <w:r>
         <w:t xml:space="preserve">Create a </w:t>
       </w:r>
-      <w:proofErr w:type="gramStart"/>
       <w:r>
         <w:t>“.</w:t>
       </w:r>
       <w:r>
         <w:t>gitlab-ci.yml</w:t>
       </w:r>
-      <w:proofErr w:type="gramEnd"/>
       <w:r>
         <w:t>”</w:t>
       </w:r>
@@ -6579,18 +6337,10 @@
         <w:t>Add “</w:t>
       </w:r>
       <w:r>
-        <w:t xml:space="preserve">--env </w:t>
-      </w:r>
-      <w:proofErr w:type="gramStart"/>
-      <w:r>
-        <w:t>production</w:t>
-      </w:r>
-      <w:r>
-        <w:t>”  to</w:t>
-      </w:r>
-      <w:proofErr w:type="gramEnd"/>
-      <w:r>
-        <w:t xml:space="preserve"> the end of the line with the swa deploy command to deploy the app to production or remove it to deploy the app to a preview url</w:t>
+        <w:t>--env production</w:t>
+      </w:r>
+      <w:r>
+        <w:t>”  to the end of the line with the swa deploy command to deploy the app to production or remove it to deploy the app to a preview url</w:t>
       </w:r>
     </w:p>
     <w:p>
@@ -6613,12 +6363,10 @@
           <w:numId w:val="37"/>
         </w:numPr>
       </w:pPr>
-      <w:proofErr w:type="gramStart"/>
       <w:r>
         <w:lastRenderedPageBreak/>
         <w:t>Watch on</w:t>
       </w:r>
-      <w:proofErr w:type="gramEnd"/>
       <w:r>
         <w:t xml:space="preserve"> the</w:t>
       </w:r>
@@ -6647,15 +6395,7 @@
         </w:numPr>
       </w:pPr>
       <w:r>
-        <w:t xml:space="preserve">Open the </w:t>
-      </w:r>
-      <w:proofErr w:type="gramStart"/>
-      <w:r>
-        <w:t>front end</w:t>
-      </w:r>
-      <w:proofErr w:type="gramEnd"/>
-      <w:r>
-        <w:t xml:space="preserve"> website. The URL can be found on the azure website for the web app that you created in step 10</w:t>
+        <w:t>Open the front end website. The URL can be found on the azure website for the web app that you created in step 10</w:t>
       </w:r>
     </w:p>
     <w:p>
@@ -6676,15 +6416,7 @@
         <w:ind w:left="1080"/>
       </w:pPr>
       <w:r>
-        <w:t xml:space="preserve">Notes for </w:t>
-      </w:r>
-      <w:proofErr w:type="gramStart"/>
-      <w:r>
-        <w:t>back end</w:t>
-      </w:r>
-      <w:proofErr w:type="gramEnd"/>
-      <w:r>
-        <w:t xml:space="preserve"> setup.</w:t>
+        <w:t>Notes for back end setup.</w:t>
       </w:r>
     </w:p>
     <w:p>
@@ -6792,15 +6524,7 @@
         </w:numPr>
       </w:pPr>
       <w:r>
-        <w:t xml:space="preserve">In the </w:t>
-      </w:r>
-      <w:proofErr w:type="gramStart"/>
-      <w:r>
-        <w:t>publish</w:t>
-      </w:r>
-      <w:proofErr w:type="gramEnd"/>
-      <w:r>
-        <w:t xml:space="preserve"> field select Code</w:t>
+        <w:t>In the publish field select Code</w:t>
       </w:r>
     </w:p>
     <w:p>
@@ -6837,10 +6561,22 @@
       </w:pPr>
       <w:r>
         <w:lastRenderedPageBreak/>
-        <w:t>Pick a region (I did West US</w:t>
+        <w:t>Pick a region (I did</w:t>
+      </w:r>
+      <w:r>
+        <w:t xml:space="preserve"> East US</w:t>
       </w:r>
       <w:r>
         <w:t xml:space="preserve"> 2</w:t>
+      </w:r>
+      <w:r>
+        <w:t>.</w:t>
+      </w:r>
+      <w:r>
+        <w:t xml:space="preserve"> If you receive an error about a quota you may need to</w:t>
+      </w:r>
+      <w:r>
+        <w:t xml:space="preserve"> ensure that you have available VMs in your quota for whatever pricing and location you are using.</w:t>
       </w:r>
       <w:r>
         <w:t>)</w:t>
@@ -6936,49 +6672,10 @@
         </w:numPr>
       </w:pPr>
       <w:r>
-        <w:t>Once the application has been created click on Overview &gt; Go to Resource</w:t>
-      </w:r>
-    </w:p>
-    <w:p>
-      <w:pPr>
-        <w:ind w:left="720" w:firstLine="0"/>
-      </w:pPr>
-      <w:r>
-        <w:drawing>
-          <wp:inline distT="0" distB="0" distL="0" distR="0" wp14:anchorId="59DE3989" wp14:editId="3D522E70">
-            <wp:extent cx="5943600" cy="2524125"/>
-            <wp:effectExtent l="0" t="0" r="0" b="9525"/>
-            <wp:docPr id="310563481" name="Picture 1"/>
-            <wp:cNvGraphicFramePr>
-              <a:graphicFrameLocks xmlns:a="http://schemas.openxmlformats.org/drawingml/2006/main" noChangeAspect="1"/>
-            </wp:cNvGraphicFramePr>
-            <a:graphic xmlns:a="http://schemas.openxmlformats.org/drawingml/2006/main">
-              <a:graphicData uri="http://schemas.openxmlformats.org/drawingml/2006/picture">
-                <pic:pic xmlns:pic="http://schemas.openxmlformats.org/drawingml/2006/picture">
-                  <pic:nvPicPr>
-                    <pic:cNvPr id="580333977" name=""/>
-                    <pic:cNvPicPr/>
-                  </pic:nvPicPr>
-                  <pic:blipFill>
-                    <a:blip r:embed="rId37"/>
-                    <a:stretch>
-                      <a:fillRect/>
-                    </a:stretch>
-                  </pic:blipFill>
-                  <pic:spPr>
-                    <a:xfrm>
-                      <a:off x="0" y="0"/>
-                      <a:ext cx="5943600" cy="2524125"/>
-                    </a:xfrm>
-                    <a:prstGeom prst="rect">
-                      <a:avLst/>
-                    </a:prstGeom>
-                  </pic:spPr>
-                </pic:pic>
-              </a:graphicData>
-            </a:graphic>
-          </wp:inline>
-        </w:drawing>
+        <w:t xml:space="preserve">Once the application has been created </w:t>
+      </w:r>
+      <w:r>
+        <w:t>go to the overview page</w:t>
       </w:r>
     </w:p>
     <w:p>
@@ -6990,16 +6687,13 @@
         </w:numPr>
       </w:pPr>
       <w:r>
-        <w:lastRenderedPageBreak/>
-        <w:t xml:space="preserve">Click </w:t>
-      </w:r>
-      <w:proofErr w:type="gramStart"/>
-      <w:r>
-        <w:t>manage</w:t>
-      </w:r>
-      <w:proofErr w:type="gramEnd"/>
-      <w:r>
-        <w:t xml:space="preserve"> deployment token at the top of the page and then copy the deployment token.</w:t>
+        <w:t xml:space="preserve">Go to settings &gt; configuration &gt; Check the </w:t>
+      </w:r>
+      <w:r>
+        <w:t>SCM Basic Auth Publishing Credentials</w:t>
+      </w:r>
+      <w:r>
+        <w:t xml:space="preserve"> box</w:t>
       </w:r>
     </w:p>
     <w:p>
@@ -7011,15 +6705,7 @@
         </w:numPr>
       </w:pPr>
       <w:r>
-        <w:t xml:space="preserve">Go to </w:t>
-      </w:r>
-      <w:proofErr w:type="gramStart"/>
-      <w:r>
-        <w:t>The</w:t>
-      </w:r>
-      <w:proofErr w:type="gramEnd"/>
-      <w:r>
-        <w:t xml:space="preserve"> gitlab repository for the project and then go to settings &gt; CI/CD &gt; Variables</w:t>
+        <w:t>Press apply</w:t>
       </w:r>
     </w:p>
     <w:p>
@@ -7031,22 +6717,241 @@
         </w:numPr>
       </w:pPr>
       <w:r>
-        <w:t xml:space="preserve">Set the key as </w:t>
-      </w:r>
-      <w:r>
-        <w:t>AZURE_STATIC_WEB_APPS_API_TOKEN</w:t>
-      </w:r>
-      <w:r>
-        <w:t xml:space="preserve"> and then paste the token into the value field</w:t>
-      </w:r>
-    </w:p>
-    <w:p>
-      <w:pPr>
-        <w:ind w:left="720" w:firstLine="0"/>
-      </w:pPr>
+        <w:t>Go back to the overview page and press download publish profile</w:t>
+      </w:r>
+    </w:p>
+    <w:p>
+      <w:pPr>
+        <w:pStyle w:val="ListParagraph"/>
+        <w:numPr>
+          <w:ilvl w:val="0"/>
+          <w:numId w:val="38"/>
+        </w:numPr>
+      </w:pPr>
+      <w:r>
+        <w:t>Set Environment Variables</w:t>
+      </w:r>
+    </w:p>
+    <w:p>
+      <w:pPr>
+        <w:pStyle w:val="ListParagraph"/>
+        <w:numPr>
+          <w:ilvl w:val="1"/>
+          <w:numId w:val="38"/>
+        </w:numPr>
+      </w:pPr>
+      <w:r>
+        <w:t>Go to Settings &gt; Environment Variables &gt; App settings</w:t>
+      </w:r>
+    </w:p>
+    <w:p>
+      <w:pPr>
+        <w:pStyle w:val="ListParagraph"/>
+        <w:numPr>
+          <w:ilvl w:val="1"/>
+          <w:numId w:val="38"/>
+        </w:numPr>
+      </w:pPr>
+      <w:r>
+        <w:t>Set the following Environment variables</w:t>
+      </w:r>
+    </w:p>
+    <w:p>
+      <w:pPr>
+        <w:pStyle w:val="ListParagraph"/>
+        <w:numPr>
+          <w:ilvl w:val="2"/>
+          <w:numId w:val="38"/>
+        </w:numPr>
+      </w:pPr>
+      <w:r>
+        <w:lastRenderedPageBreak/>
+        <w:t>Jwt__Key</w:t>
+      </w:r>
+    </w:p>
+    <w:p>
+      <w:pPr>
+        <w:pStyle w:val="ListParagraph"/>
+        <w:numPr>
+          <w:ilvl w:val="3"/>
+          <w:numId w:val="38"/>
+        </w:numPr>
+      </w:pPr>
+      <w:r>
+        <w:t>Secret key to identify the server. Set the value to a 32+ digit random string.</w:t>
+      </w:r>
+    </w:p>
+    <w:p>
+      <w:pPr>
+        <w:pStyle w:val="ListParagraph"/>
+        <w:numPr>
+          <w:ilvl w:val="2"/>
+          <w:numId w:val="38"/>
+        </w:numPr>
+      </w:pPr>
+      <w:r>
+        <w:t>Jwt__Issuer</w:t>
+      </w:r>
+    </w:p>
+    <w:p>
+      <w:pPr>
+        <w:pStyle w:val="ListParagraph"/>
+        <w:numPr>
+          <w:ilvl w:val="3"/>
+          <w:numId w:val="38"/>
+        </w:numPr>
+      </w:pPr>
+      <w:r>
+        <w:t>Used to identify the issuer of the authentication token. Give it a name as its value</w:t>
+      </w:r>
+    </w:p>
+    <w:p>
+      <w:pPr>
+        <w:pStyle w:val="ListParagraph"/>
+        <w:numPr>
+          <w:ilvl w:val="2"/>
+          <w:numId w:val="38"/>
+        </w:numPr>
+      </w:pPr>
+      <w:r>
+        <w:t>Jwt__Audience</w:t>
+      </w:r>
+    </w:p>
+    <w:p>
+      <w:pPr>
+        <w:pStyle w:val="ListParagraph"/>
+        <w:numPr>
+          <w:ilvl w:val="3"/>
+          <w:numId w:val="38"/>
+        </w:numPr>
+      </w:pPr>
+      <w:r>
+        <w:t>Used to identify the application that uses the authentication token. Give it a name as its value</w:t>
+      </w:r>
+    </w:p>
+    <w:p>
+      <w:pPr>
+        <w:pStyle w:val="ListParagraph"/>
+        <w:numPr>
+          <w:ilvl w:val="2"/>
+          <w:numId w:val="38"/>
+        </w:numPr>
+      </w:pPr>
+      <w:r>
+        <w:t>User__Admin_Username</w:t>
+      </w:r>
+    </w:p>
+    <w:p>
+      <w:pPr>
+        <w:pStyle w:val="ListParagraph"/>
+        <w:numPr>
+          <w:ilvl w:val="2"/>
+          <w:numId w:val="38"/>
+        </w:numPr>
+      </w:pPr>
+      <w:r>
+        <w:t>User__Admin_Password</w:t>
+      </w:r>
+    </w:p>
+    <w:p>
+      <w:pPr>
+        <w:pStyle w:val="ListParagraph"/>
+        <w:numPr>
+          <w:ilvl w:val="1"/>
+          <w:numId w:val="38"/>
+        </w:numPr>
+      </w:pPr>
+      <w:r>
+        <w:t>Set the following connection String ()</w:t>
+      </w:r>
+    </w:p>
+    <w:p>
+      <w:pPr>
+        <w:pStyle w:val="ListParagraph"/>
+        <w:numPr>
+          <w:ilvl w:val="2"/>
+          <w:numId w:val="38"/>
+        </w:numPr>
+      </w:pPr>
+      <w:r>
+        <w:t xml:space="preserve">Name: </w:t>
+      </w:r>
+      <w:r>
+        <w:t>“</w:t>
+      </w:r>
+      <w:r>
+        <w:t>DefaultConnection</w:t>
+      </w:r>
+      <w:r>
+        <w:t>”</w:t>
+      </w:r>
+    </w:p>
+    <w:p>
+      <w:pPr>
+        <w:pStyle w:val="ListParagraph"/>
+        <w:numPr>
+          <w:ilvl w:val="2"/>
+          <w:numId w:val="38"/>
+        </w:numPr>
+      </w:pPr>
+      <w:r>
+        <w:t xml:space="preserve">Value: </w:t>
+      </w:r>
+      <w:r>
+        <w:t>”</w:t>
+      </w:r>
+      <w:r>
+        <w:t>D:\home\site\wwwroot\Data\BacklogManager.db</w:t>
+      </w:r>
+      <w:r>
+        <w:t>”</w:t>
+      </w:r>
+    </w:p>
+    <w:p>
+      <w:pPr>
+        <w:pStyle w:val="ListParagraph"/>
+        <w:numPr>
+          <w:ilvl w:val="2"/>
+          <w:numId w:val="38"/>
+        </w:numPr>
+      </w:pPr>
+      <w:r>
+        <w:t xml:space="preserve">Type: </w:t>
+      </w:r>
+      <w:r>
+        <w:t>“</w:t>
+      </w:r>
+      <w:r>
+        <w:t>Custom</w:t>
+      </w:r>
+      <w:r>
+        <w:t>”</w:t>
+      </w:r>
+    </w:p>
+    <w:p>
+      <w:pPr>
+        <w:pStyle w:val="ListParagraph"/>
+        <w:numPr>
+          <w:ilvl w:val="0"/>
+          <w:numId w:val="38"/>
+        </w:numPr>
+      </w:pPr>
+      <w:r>
+        <w:lastRenderedPageBreak/>
+        <w:t xml:space="preserve">Go to </w:t>
+      </w:r>
+      <w:r>
+        <w:t>t</w:t>
+      </w:r>
+      <w:r>
+        <w:t>he gitlab repository for the project and then go to settings &gt; CI/CD &gt; Variables</w:t>
+      </w:r>
+      <w:r>
+        <w:t xml:space="preserve"> &gt; add Variable</w:t>
+      </w:r>
       <w:r>
         <w:drawing>
-          <wp:inline distT="0" distB="0" distL="0" distR="0" wp14:anchorId="14CC4739" wp14:editId="7BD50296">
+          <wp:inline distT="0" distB="0" distL="0" distR="0" wp14:anchorId="746AA46A" wp14:editId="65905ED8">
             <wp:extent cx="5943600" cy="3415030"/>
             <wp:effectExtent l="0" t="0" r="0" b="0"/>
             <wp:docPr id="876598561" name="Picture 1"/>
@@ -7091,15 +6996,7 @@
         </w:numPr>
       </w:pPr>
       <w:r>
-        <w:t xml:space="preserve">Hit </w:t>
-      </w:r>
-      <w:proofErr w:type="gramStart"/>
-      <w:r>
-        <w:t>save</w:t>
-      </w:r>
-      <w:proofErr w:type="gramEnd"/>
-      <w:r>
-        <w:t>.</w:t>
+        <w:t>Change the variable type to file and the visibility to visible</w:t>
       </w:r>
     </w:p>
     <w:p>
@@ -7111,18 +7008,16 @@
         </w:numPr>
       </w:pPr>
       <w:r>
-        <w:t xml:space="preserve">Create a </w:t>
-      </w:r>
-      <w:proofErr w:type="gramStart"/>
-      <w:r>
-        <w:t>“.</w:t>
-      </w:r>
-      <w:r>
-        <w:t>gitlab-ci.yml</w:t>
-      </w:r>
-      <w:proofErr w:type="gramEnd"/>
-      <w:r>
-        <w:t>” file in the repository root. – this will allow gitlab to connect to azure and automatically deploy the application.</w:t>
+        <w:t xml:space="preserve">Key : </w:t>
+      </w:r>
+      <w:r>
+        <w:t>“</w:t>
+      </w:r>
+      <w:r>
+        <w:t>AZURE_PUBLISH_PROFILE</w:t>
+      </w:r>
+      <w:r>
+        <w:t>”</w:t>
       </w:r>
     </w:p>
     <w:p>
@@ -7134,45 +7029,7 @@
         </w:numPr>
       </w:pPr>
       <w:r>
-        <w:t xml:space="preserve">Create the yml file </w:t>
-      </w:r>
-    </w:p>
-    <w:p>
-      <w:pPr>
-        <w:pStyle w:val="ListParagraph"/>
-        <w:numPr>
-          <w:ilvl w:val="1"/>
-          <w:numId w:val="38"/>
-        </w:numPr>
-      </w:pPr>
-      <w:r>
-        <w:t>Example YML file is in the root of the Gitlab Repository</w:t>
-      </w:r>
-    </w:p>
-    <w:p>
-      <w:pPr>
-        <w:pStyle w:val="ListParagraph"/>
-        <w:numPr>
-          <w:ilvl w:val="1"/>
-          <w:numId w:val="38"/>
-        </w:numPr>
-      </w:pPr>
-      <w:r>
-        <w:t>Add “</w:t>
-      </w:r>
-      <w:r>
-        <w:t xml:space="preserve">--env </w:t>
-      </w:r>
-      <w:proofErr w:type="gramStart"/>
-      <w:r>
-        <w:t>production</w:t>
-      </w:r>
-      <w:r>
-        <w:t>”  to</w:t>
-      </w:r>
-      <w:proofErr w:type="gramEnd"/>
-      <w:r>
-        <w:t xml:space="preserve"> the end of the line with the swa deploy command to deploy the app to production or remove it to deploy the app to a preview url</w:t>
+        <w:t>Value : Paste the contents from the publish profile that was downloaded in step 15</w:t>
       </w:r>
     </w:p>
     <w:p>
@@ -7184,7 +7041,7 @@
         </w:numPr>
       </w:pPr>
       <w:r>
-        <w:t>Add, Commit, and Push the repository with the YML file.</w:t>
+        <w:t>Hit save.</w:t>
       </w:r>
     </w:p>
     <w:p>
@@ -7195,14 +7052,11 @@
           <w:numId w:val="38"/>
         </w:numPr>
       </w:pPr>
-      <w:proofErr w:type="gramStart"/>
-      <w:r>
-        <w:lastRenderedPageBreak/>
-        <w:t>Watch on</w:t>
-      </w:r>
-      <w:proofErr w:type="gramEnd"/>
-      <w:r>
-        <w:t xml:space="preserve"> the GitLab pipelines page to ensure that the application is deployed to azure successfully.</w:t>
+      <w:r>
+        <w:t>Add, Commit, and Push the repository</w:t>
+      </w:r>
+      <w:r>
+        <w:t xml:space="preserve"> (The Respository contains a YML File with the correct commands to deploy the application on the front and back end)</w:t>
       </w:r>
     </w:p>
     <w:p>
@@ -7214,16 +7068,17 @@
         </w:numPr>
       </w:pPr>
       <w:r>
-        <w:t xml:space="preserve">Open the </w:t>
-      </w:r>
-      <w:proofErr w:type="gramStart"/>
-      <w:r>
-        <w:t>front end</w:t>
-      </w:r>
-      <w:proofErr w:type="gramEnd"/>
-      <w:r>
-        <w:t xml:space="preserve"> website. The URL can be found on the azure website for the web app that you created in step 10</w:t>
-      </w:r>
+        <w:t>Watch on the GitLab pipelines page to ensure that the application is deployed to azure successfully.</w:t>
+      </w:r>
+    </w:p>
+    <w:p>
+      <w:pPr>
+        <w:pStyle w:val="ListParagraph"/>
+        <w:numPr>
+          <w:ilvl w:val="0"/>
+          <w:numId w:val="38"/>
+        </w:numPr>
+      </w:pPr>
     </w:p>
     <w:p>
       <w:pPr>
@@ -9520,7 +9375,7 @@
         <w:ind w:left="1440" w:hanging="360"/>
       </w:pPr>
     </w:lvl>
-    <w:lvl w:ilvl="2" w:tplc="0409001B" w:tentative="1">
+    <w:lvl w:ilvl="2" w:tplc="0409001B">
       <w:start w:val="1"/>
       <w:numFmt w:val="lowerRoman"/>
       <w:lvlText w:val="%3."/>
@@ -9529,7 +9384,7 @@
         <w:ind w:left="2160" w:hanging="180"/>
       </w:pPr>
     </w:lvl>
-    <w:lvl w:ilvl="3" w:tplc="0409000F" w:tentative="1">
+    <w:lvl w:ilvl="3" w:tplc="0409000F">
       <w:start w:val="1"/>
       <w:numFmt w:val="decimal"/>
       <w:lvlText w:val="%4."/>

</xml_diff>

<commit_message>
Fixes a bug that kept the date completed field from being set durring an update
</commit_message>
<xml_diff>
--- a/documentation/task3.docx
+++ b/documentation/task3.docx
@@ -2515,15 +2515,7 @@
     </w:p>
     <w:p>
       <w:r>
-        <w:t xml:space="preserve">There are 3 main classes involved in the media backlog manager, User, Media, and </w:t>
-      </w:r>
-      <w:proofErr w:type="spellStart"/>
-      <w:r>
-        <w:t>UserMedia</w:t>
-      </w:r>
-      <w:proofErr w:type="spellEnd"/>
-      <w:r>
-        <w:t xml:space="preserve">. </w:t>
+        <w:t xml:space="preserve">There are 3 main classes involved in the media backlog manager, User, Media, and UserMedia. </w:t>
       </w:r>
       <w:r>
         <w:t xml:space="preserve"> </w:t>
@@ -2550,47 +2542,16 @@
         <w:t xml:space="preserve">also </w:t>
       </w:r>
       <w:r>
-        <w:t xml:space="preserve">enables polymorphic handling of data throughout the application. Lastly the </w:t>
-      </w:r>
-      <w:proofErr w:type="spellStart"/>
-      <w:r>
-        <w:t>UserMedia</w:t>
-      </w:r>
-      <w:proofErr w:type="spellEnd"/>
-      <w:r>
-        <w:t xml:space="preserve"> Class </w:t>
+        <w:t xml:space="preserve">enables polymorphic handling of data throughout the application. Lastly the UserMedia Class </w:t>
       </w:r>
       <w:r>
         <w:t xml:space="preserve">facilitates a many to Many </w:t>
       </w:r>
-      <w:proofErr w:type="gramStart"/>
       <w:r>
         <w:t>relationship</w:t>
       </w:r>
-      <w:proofErr w:type="gramEnd"/>
-      <w:r>
-        <w:t xml:space="preserve"> between User and Media. The </w:t>
-      </w:r>
-      <w:proofErr w:type="spellStart"/>
-      <w:r>
-        <w:t>UserMedia</w:t>
-      </w:r>
-      <w:proofErr w:type="spellEnd"/>
-      <w:r>
-        <w:t xml:space="preserve"> class holds information that is specific to </w:t>
-      </w:r>
-      <w:proofErr w:type="spellStart"/>
-      <w:r>
-        <w:t xml:space="preserve">a </w:t>
-      </w:r>
-      <w:proofErr w:type="gramStart"/>
-      <w:r>
-        <w:t>users</w:t>
-      </w:r>
-      <w:proofErr w:type="spellEnd"/>
-      <w:proofErr w:type="gramEnd"/>
-      <w:r>
-        <w:t xml:space="preserve"> relationship to a piece of media. For </w:t>
+      <w:r>
+        <w:t xml:space="preserve"> between User and Media. The UserMedia class holds information that is specific to a users relationship to a piece of media. For </w:t>
       </w:r>
       <w:r>
         <w:t>example,</w:t>
@@ -2663,15 +2624,7 @@
     <w:p>
       <w:r>
         <w:lastRenderedPageBreak/>
-        <w:t xml:space="preserve">Shown in the center column of the diagram above, is the structure of the 3 main classes that the application works with, along with the derived media classes shown on the left. On the right side of the diagram are additional classes that are used to track specific properties used by the Game class, the Media class, and the </w:t>
-      </w:r>
-      <w:proofErr w:type="spellStart"/>
-      <w:r>
-        <w:t>UserMedia</w:t>
-      </w:r>
-      <w:proofErr w:type="spellEnd"/>
-      <w:r>
-        <w:t xml:space="preserve"> Class.</w:t>
+        <w:t>Shown in the center column of the diagram above, is the structure of the 3 main classes that the application works with, along with the derived media classes shown on the left. On the right side of the diagram are additional classes that are used to track specific properties used by the Game class, the Media class, and the UserMedia Class.</w:t>
       </w:r>
       <w:bookmarkStart w:id="3" w:name="_Toc233458533"/>
       <w:bookmarkStart w:id="4" w:name="_Toc233463900"/>
@@ -2704,15 +2657,7 @@
     </w:p>
     <w:p>
       <w:r>
-        <w:t xml:space="preserve">Shown below are various UI wireframes created early in development. On the left the </w:t>
-      </w:r>
-      <w:proofErr w:type="gramStart"/>
-      <w:r>
-        <w:t>Home</w:t>
-      </w:r>
-      <w:proofErr w:type="gramEnd"/>
-      <w:r>
-        <w:t xml:space="preserve"> screen is shown, and on the right the “Add Media” page and “Media View” page are shown. These wireframes show the main pages of the apps. Many additional fields have been added as additional features and fields have been required.</w:t>
+        <w:t>Shown below are various UI wireframes created early in development. On the left the Home screen is shown, and on the right the “Add Media” page and “Media View” page are shown. These wireframes show the main pages of the apps. Many additional fields have been added as additional features and fields have been required.</w:t>
       </w:r>
     </w:p>
     <w:p>
@@ -3226,26 +3171,10 @@
     </w:p>
     <w:p>
       <w:r>
-        <w:t xml:space="preserve">Various Testing methods will be utilized to ensure that the application functions as desired. </w:t>
-      </w:r>
-      <w:proofErr w:type="spellStart"/>
-      <w:r>
-        <w:t>xUnit</w:t>
-      </w:r>
-      <w:proofErr w:type="spellEnd"/>
-      <w:r>
-        <w:t xml:space="preserve"> will be used to perform Unit Testing. Postman will be used to perform integration testing and API Testing. End to end Testing will be done manually. These tests will be used to ensure that individual units, API endpoints, and application features all behave as expected.</w:t>
-      </w:r>
-      <w:r>
-        <w:t xml:space="preserve"> When tests </w:t>
-      </w:r>
-      <w:proofErr w:type="gramStart"/>
-      <w:r>
-        <w:t>are failed</w:t>
-      </w:r>
-      <w:proofErr w:type="gramEnd"/>
-      <w:r>
-        <w:t>, root cause analysis will take place, and the root of the issue will be fixed.</w:t>
+        <w:t>Various Testing methods will be utilized to ensure that the application functions as desired. xUnit will be used to perform Unit Testing. Postman will be used to perform integration testing and API Testing. End to end Testing will be done manually. These tests will be used to ensure that individual units, API endpoints, and application features all behave as expected.</w:t>
+      </w:r>
+      <w:r>
+        <w:t xml:space="preserve"> When tests are failed, root cause analysis will take place, and the root of the issue will be fixed.</w:t>
       </w:r>
     </w:p>
     <w:p>
@@ -3262,15 +3191,7 @@
     </w:p>
     <w:p>
       <w:r>
-        <w:t xml:space="preserve">Three main testing methods will be used. First, Unit Testing will be done using </w:t>
-      </w:r>
-      <w:proofErr w:type="spellStart"/>
-      <w:r>
-        <w:t>xUnit</w:t>
-      </w:r>
-      <w:proofErr w:type="spellEnd"/>
-      <w:r>
-        <w:t xml:space="preserve">. These unit tests will ensure that individual service methods function as expected given various inputs. It also tests cases that should fail and ensures that they fail gracefully. Second, integration testing and API testing will be completed with Postman. Integration testing will ensure that the API controllers interact properly with the application services. Each of the API requests in the collection will be used to test the CRUD operations made available through the API. </w:t>
+        <w:t xml:space="preserve">Three main testing methods will be used. First, Unit Testing will be done using xUnit. These unit tests will ensure that individual service methods function as expected given various inputs. It also tests cases that should fail and ensures that they fail gracefully. Second, integration testing and API testing will be completed with Postman. Integration testing will ensure that the API controllers interact properly with the application services. Each of the API requests in the collection will be used to test the CRUD operations made available through the API. </w:t>
       </w:r>
       <w:r>
         <w:t>Further, the postman tests will be used to test the authentication method built into the application, only allowing requests that bear the proper authentication token to perform actions. Lastly, end to end testing will be done manually. These tests will be done to ensure that the front end communicates with the back end properly. These tests will ensure that any feature properly behaves on the front end, makes the necessary changes on the back end, or retires data correctly.</w:t>
@@ -3444,23 +3365,7 @@
         </w:numPr>
       </w:pPr>
       <w:r>
-        <w:t xml:space="preserve">A Testing Framework will be needed so the tests can be composed and </w:t>
-      </w:r>
-      <w:proofErr w:type="gramStart"/>
-      <w:r>
-        <w:t>Run</w:t>
-      </w:r>
-      <w:proofErr w:type="gramEnd"/>
-      <w:r>
-        <w:t xml:space="preserve">. </w:t>
-      </w:r>
-      <w:proofErr w:type="spellStart"/>
-      <w:r>
-        <w:t>xUnit</w:t>
-      </w:r>
-      <w:proofErr w:type="spellEnd"/>
-      <w:r>
-        <w:t xml:space="preserve"> has been used for these unit tests.</w:t>
+        <w:t>A Testing Framework will be needed so the tests can be composed and Run. xUnit has been used for these unit tests.</w:t>
       </w:r>
     </w:p>
     <w:p>
@@ -3560,15 +3465,7 @@
         </w:numPr>
       </w:pPr>
       <w:r>
-        <w:t xml:space="preserve">Each Test will produce test results. These results will be automatically produced by the testing </w:t>
-      </w:r>
-      <w:proofErr w:type="gramStart"/>
-      <w:r>
-        <w:t>frame work</w:t>
-      </w:r>
-      <w:proofErr w:type="gramEnd"/>
-      <w:r>
-        <w:t xml:space="preserve"> and will show the result of each test.</w:t>
+        <w:t>Each Test will produce test results. These results will be automatically produced by the testing frame work and will show the result of each test.</w:t>
       </w:r>
       <w:r>
         <w:t xml:space="preserve"> </w:t>
@@ -3595,50 +3492,10 @@
         </w:numPr>
       </w:pPr>
       <w:r>
-        <w:t xml:space="preserve">To begin the tests, a suitable development environment will need to be set up. Within this environment, ASP.net development tools and </w:t>
-      </w:r>
-      <w:proofErr w:type="spellStart"/>
-      <w:r>
-        <w:t>xUnit</w:t>
-      </w:r>
-      <w:proofErr w:type="spellEnd"/>
-      <w:r>
-        <w:t xml:space="preserve"> must be installed.</w:t>
-      </w:r>
-      <w:r>
-        <w:t xml:space="preserve"> The dependencies within the ASP.net project will also need to be installed. These include </w:t>
-      </w:r>
-      <w:proofErr w:type="spellStart"/>
-      <w:r>
-        <w:t>EntityFrameworkCore</w:t>
-      </w:r>
-      <w:proofErr w:type="spellEnd"/>
-      <w:r>
-        <w:t xml:space="preserve">, </w:t>
-      </w:r>
-      <w:proofErr w:type="spellStart"/>
-      <w:r>
-        <w:t>EntityFrameworkCore.InMemory</w:t>
-      </w:r>
-      <w:proofErr w:type="spellEnd"/>
-      <w:r>
-        <w:t xml:space="preserve">, </w:t>
-      </w:r>
-      <w:proofErr w:type="spellStart"/>
-      <w:r>
-        <w:t>SQLitePCL</w:t>
-      </w:r>
-      <w:proofErr w:type="spellEnd"/>
-      <w:r>
-        <w:t xml:space="preserve">, and </w:t>
-      </w:r>
-      <w:proofErr w:type="spellStart"/>
-      <w:r>
-        <w:t>Microsoft.Identity</w:t>
-      </w:r>
-      <w:proofErr w:type="spellEnd"/>
-      <w:r>
-        <w:t>.</w:t>
+        <w:t>To begin the tests, a suitable development environment will need to be set up. Within this environment, ASP.net development tools and xUnit must be installed.</w:t>
+      </w:r>
+      <w:r>
+        <w:t xml:space="preserve"> The dependencies within the ASP.net project will also need to be installed. These include EntityFrameworkCore, EntityFrameworkCore.InMemory, SQLitePCL, and Microsoft.Identity.</w:t>
       </w:r>
     </w:p>
     <w:p>
@@ -3662,13 +3519,8 @@
         </w:numPr>
       </w:pPr>
       <w:r>
-        <w:t xml:space="preserve">Dependency Injection must be manually set up for proper testing of the authentication service as it is heavily used within the application due to its use of </w:t>
-      </w:r>
-      <w:proofErr w:type="gramStart"/>
-      <w:r>
-        <w:t>ASP.net .</w:t>
-      </w:r>
-      <w:proofErr w:type="gramEnd"/>
+        <w:t>Dependency Injection must be manually set up for proper testing of the authentication service as it is heavily used within the application due to its use of ASP.net .</w:t>
+      </w:r>
     </w:p>
     <w:p>
       <w:pPr>
@@ -3682,15 +3534,7 @@
         <w:t xml:space="preserve">The Database must be configured within as the application uses an SQLite Database. The database will be set up as </w:t>
       </w:r>
       <w:r>
-        <w:t xml:space="preserve">an </w:t>
-      </w:r>
-      <w:proofErr w:type="gramStart"/>
-      <w:r>
-        <w:t>in memory</w:t>
-      </w:r>
-      <w:proofErr w:type="gramEnd"/>
-      <w:r>
-        <w:t xml:space="preserve"> database, which will be completely fresh for each test.</w:t>
+        <w:t>an in memory database, which will be completely fresh for each test.</w:t>
       </w:r>
     </w:p>
     <w:p>
@@ -3797,13 +3641,8 @@
       <w:bookmarkEnd w:id="27"/>
     </w:p>
     <w:p>
-      <w:proofErr w:type="gramStart"/>
-      <w:r>
-        <w:t>Register</w:t>
-      </w:r>
-      <w:proofErr w:type="gramEnd"/>
-      <w:r>
-        <w:t xml:space="preserve"> a new User</w:t>
+      <w:r>
+        <w:t>Register a new User</w:t>
       </w:r>
     </w:p>
     <w:p>
@@ -3830,15 +3669,7 @@
         </w:numPr>
       </w:pPr>
       <w:r>
-        <w:t xml:space="preserve">An </w:t>
-      </w:r>
-      <w:proofErr w:type="spellStart"/>
-      <w:r>
-        <w:t>AuthResponse</w:t>
-      </w:r>
-      <w:proofErr w:type="spellEnd"/>
-      <w:r>
-        <w:t xml:space="preserve"> object is returned.</w:t>
+        <w:t>An AuthResponse object is returned.</w:t>
       </w:r>
     </w:p>
     <w:p>
@@ -3850,15 +3681,7 @@
         </w:numPr>
       </w:pPr>
       <w:r>
-        <w:t xml:space="preserve">The </w:t>
-      </w:r>
-      <w:proofErr w:type="spellStart"/>
-      <w:r>
-        <w:t>AuthResponse</w:t>
-      </w:r>
-      <w:proofErr w:type="spellEnd"/>
-      <w:r>
-        <w:t xml:space="preserve"> object contains a token</w:t>
+        <w:t>The AuthResponse object contains a token</w:t>
       </w:r>
     </w:p>
     <w:p>
@@ -3870,15 +3693,7 @@
         </w:numPr>
       </w:pPr>
       <w:r>
-        <w:t xml:space="preserve">The </w:t>
-      </w:r>
-      <w:proofErr w:type="spellStart"/>
-      <w:r>
-        <w:t>AuthResponse</w:t>
-      </w:r>
-      <w:proofErr w:type="spellEnd"/>
-      <w:r>
-        <w:t xml:space="preserve"> object does not contain any error in its error list</w:t>
+        <w:t>The AuthResponse object does not contain any error in its error list</w:t>
       </w:r>
     </w:p>
     <w:p>
@@ -3889,13 +3704,8 @@
           <w:numId w:val="11"/>
         </w:numPr>
       </w:pPr>
-      <w:proofErr w:type="gramStart"/>
-      <w:r>
-        <w:t>Fail</w:t>
-      </w:r>
-      <w:proofErr w:type="gramEnd"/>
-      <w:r>
-        <w:t>:</w:t>
+      <w:r>
+        <w:t>Fail:</w:t>
       </w:r>
       <w:r>
         <w:tab/>
@@ -3910,15 +3720,7 @@
         </w:numPr>
       </w:pPr>
       <w:r>
-        <w:t xml:space="preserve">An </w:t>
-      </w:r>
-      <w:proofErr w:type="spellStart"/>
-      <w:r>
-        <w:t>AuthResponse</w:t>
-      </w:r>
-      <w:proofErr w:type="spellEnd"/>
-      <w:r>
-        <w:t xml:space="preserve"> object is not returned</w:t>
+        <w:t>An AuthResponse object is not returned</w:t>
       </w:r>
     </w:p>
     <w:p>
@@ -3930,15 +3732,7 @@
         </w:numPr>
       </w:pPr>
       <w:r>
-        <w:t xml:space="preserve">The </w:t>
-      </w:r>
-      <w:proofErr w:type="spellStart"/>
-      <w:r>
-        <w:t>AuthResponse</w:t>
-      </w:r>
-      <w:proofErr w:type="spellEnd"/>
-      <w:r>
-        <w:t xml:space="preserve"> object does not contain a token</w:t>
+        <w:t>The AuthResponse object does not contain a token</w:t>
       </w:r>
     </w:p>
     <w:p>
@@ -3950,15 +3744,7 @@
         </w:numPr>
       </w:pPr>
       <w:r>
-        <w:t xml:space="preserve">The </w:t>
-      </w:r>
-      <w:proofErr w:type="spellStart"/>
-      <w:r>
-        <w:t>AuthResponse</w:t>
-      </w:r>
-      <w:proofErr w:type="spellEnd"/>
-      <w:r>
-        <w:t xml:space="preserve"> object contains an error in its error list</w:t>
+        <w:t>The AuthResponse object contains an error in its error list</w:t>
       </w:r>
     </w:p>
     <w:p>
@@ -3979,14 +3765,9 @@
       </w:r>
     </w:p>
     <w:p>
-      <w:proofErr w:type="gramStart"/>
       <w:r>
         <w:lastRenderedPageBreak/>
-        <w:t>Register</w:t>
-      </w:r>
-      <w:proofErr w:type="gramEnd"/>
-      <w:r>
-        <w:t xml:space="preserve"> a new User</w:t>
+        <w:t>Register a new User</w:t>
       </w:r>
     </w:p>
     <w:p>
@@ -4013,15 +3794,7 @@
         </w:numPr>
       </w:pPr>
       <w:r>
-        <w:t xml:space="preserve">An </w:t>
-      </w:r>
-      <w:proofErr w:type="spellStart"/>
-      <w:r>
-        <w:t>AuthResponse</w:t>
-      </w:r>
-      <w:proofErr w:type="spellEnd"/>
-      <w:r>
-        <w:t xml:space="preserve"> object is returned.</w:t>
+        <w:t>An AuthResponse object is returned.</w:t>
       </w:r>
     </w:p>
     <w:p>
@@ -4033,15 +3806,7 @@
         </w:numPr>
       </w:pPr>
       <w:r>
-        <w:t xml:space="preserve">The </w:t>
-      </w:r>
-      <w:proofErr w:type="spellStart"/>
-      <w:r>
-        <w:t>AuthResponse</w:t>
-      </w:r>
-      <w:proofErr w:type="spellEnd"/>
-      <w:r>
-        <w:t xml:space="preserve"> object contains a token</w:t>
+        <w:t>The AuthResponse object contains a token</w:t>
       </w:r>
     </w:p>
     <w:p>
@@ -4053,15 +3818,7 @@
         </w:numPr>
       </w:pPr>
       <w:r>
-        <w:t xml:space="preserve">The </w:t>
-      </w:r>
-      <w:proofErr w:type="spellStart"/>
-      <w:r>
-        <w:t>AuthResponse</w:t>
-      </w:r>
-      <w:proofErr w:type="spellEnd"/>
-      <w:r>
-        <w:t xml:space="preserve"> object does not contain any error in its error list</w:t>
+        <w:t>The AuthResponse object does not contain any error in its error list</w:t>
       </w:r>
     </w:p>
     <w:p>
@@ -4072,13 +3829,8 @@
           <w:numId w:val="11"/>
         </w:numPr>
       </w:pPr>
-      <w:proofErr w:type="gramStart"/>
-      <w:r>
-        <w:t>Fail</w:t>
-      </w:r>
-      <w:proofErr w:type="gramEnd"/>
-      <w:r>
-        <w:t>:</w:t>
+      <w:r>
+        <w:t>Fail:</w:t>
       </w:r>
       <w:r>
         <w:tab/>
@@ -4093,15 +3845,7 @@
         </w:numPr>
       </w:pPr>
       <w:r>
-        <w:t xml:space="preserve">An </w:t>
-      </w:r>
-      <w:proofErr w:type="spellStart"/>
-      <w:r>
-        <w:t>AuthResponse</w:t>
-      </w:r>
-      <w:proofErr w:type="spellEnd"/>
-      <w:r>
-        <w:t xml:space="preserve"> object is not returned</w:t>
+        <w:t>An AuthResponse object is not returned</w:t>
       </w:r>
     </w:p>
     <w:p>
@@ -4113,15 +3857,7 @@
         </w:numPr>
       </w:pPr>
       <w:r>
-        <w:t xml:space="preserve">The </w:t>
-      </w:r>
-      <w:proofErr w:type="spellStart"/>
-      <w:r>
-        <w:t>AuthResponse</w:t>
-      </w:r>
-      <w:proofErr w:type="spellEnd"/>
-      <w:r>
-        <w:t xml:space="preserve"> object does not contain a token</w:t>
+        <w:t>The AuthResponse object does not contain a token</w:t>
       </w:r>
     </w:p>
     <w:p>
@@ -4133,15 +3869,7 @@
         </w:numPr>
       </w:pPr>
       <w:r>
-        <w:t xml:space="preserve">The </w:t>
-      </w:r>
-      <w:proofErr w:type="spellStart"/>
-      <w:r>
-        <w:t>AuthResponse</w:t>
-      </w:r>
-      <w:proofErr w:type="spellEnd"/>
-      <w:r>
-        <w:t xml:space="preserve"> object contains an error in its error list</w:t>
+        <w:t>The AuthResponse object contains an error in its error list</w:t>
       </w:r>
     </w:p>
     <w:p>
@@ -4196,13 +3924,8 @@
           <w:numId w:val="11"/>
         </w:numPr>
       </w:pPr>
-      <w:proofErr w:type="gramStart"/>
-      <w:r>
-        <w:t>Fail</w:t>
-      </w:r>
-      <w:proofErr w:type="gramEnd"/>
-      <w:r>
-        <w:t>:</w:t>
+      <w:r>
+        <w:t>Fail:</w:t>
       </w:r>
       <w:r>
         <w:tab/>
@@ -4261,15 +3984,7 @@
         </w:numPr>
       </w:pPr>
       <w:r>
-        <w:t xml:space="preserve">An </w:t>
-      </w:r>
-      <w:proofErr w:type="spellStart"/>
-      <w:r>
-        <w:t>AuthResponse</w:t>
-      </w:r>
-      <w:proofErr w:type="spellEnd"/>
-      <w:r>
-        <w:t xml:space="preserve"> object is returned.</w:t>
+        <w:t>An AuthResponse object is returned.</w:t>
       </w:r>
     </w:p>
     <w:p>
@@ -4281,15 +3996,7 @@
         </w:numPr>
       </w:pPr>
       <w:r>
-        <w:t xml:space="preserve">The </w:t>
-      </w:r>
-      <w:proofErr w:type="spellStart"/>
-      <w:r>
-        <w:t>AuthResponse</w:t>
-      </w:r>
-      <w:proofErr w:type="spellEnd"/>
-      <w:r>
-        <w:t xml:space="preserve"> object does not contain a token</w:t>
+        <w:t>The AuthResponse object does not contain a token</w:t>
       </w:r>
     </w:p>
     <w:p>
@@ -4302,15 +4009,7 @@
         <w:ind w:left="1800" w:firstLine="0"/>
       </w:pPr>
       <w:r>
-        <w:t xml:space="preserve">The </w:t>
-      </w:r>
-      <w:proofErr w:type="spellStart"/>
-      <w:r>
-        <w:t>AuthResponse</w:t>
-      </w:r>
-      <w:proofErr w:type="spellEnd"/>
-      <w:r>
-        <w:t xml:space="preserve"> object contains errors in its error list</w:t>
+        <w:t>The AuthResponse object contains errors in its error list</w:t>
       </w:r>
     </w:p>
     <w:p>
@@ -4336,13 +4035,8 @@
           <w:numId w:val="11"/>
         </w:numPr>
       </w:pPr>
-      <w:proofErr w:type="gramStart"/>
-      <w:r>
-        <w:t>Fail</w:t>
-      </w:r>
-      <w:proofErr w:type="gramEnd"/>
-      <w:r>
-        <w:t>:</w:t>
+      <w:r>
+        <w:t>Fail:</w:t>
       </w:r>
       <w:r>
         <w:tab/>
@@ -4358,15 +4052,7 @@
       </w:pPr>
       <w:r>
         <w:lastRenderedPageBreak/>
-        <w:t xml:space="preserve">An </w:t>
-      </w:r>
-      <w:proofErr w:type="spellStart"/>
-      <w:r>
-        <w:t>AuthResponse</w:t>
-      </w:r>
-      <w:proofErr w:type="spellEnd"/>
-      <w:r>
-        <w:t xml:space="preserve"> object is not returned</w:t>
+        <w:t>An AuthResponse object is not returned</w:t>
       </w:r>
     </w:p>
     <w:p>
@@ -4378,15 +4064,7 @@
         </w:numPr>
       </w:pPr>
       <w:r>
-        <w:t xml:space="preserve">The </w:t>
-      </w:r>
-      <w:proofErr w:type="spellStart"/>
-      <w:r>
-        <w:t>AuthResponse</w:t>
-      </w:r>
-      <w:proofErr w:type="spellEnd"/>
-      <w:r>
-        <w:t xml:space="preserve"> object contain</w:t>
+        <w:t>The AuthResponse object contain</w:t>
       </w:r>
       <w:r>
         <w:t>s</w:t>
@@ -4404,15 +4082,7 @@
         </w:numPr>
       </w:pPr>
       <w:r>
-        <w:t xml:space="preserve">The </w:t>
-      </w:r>
-      <w:proofErr w:type="spellStart"/>
-      <w:r>
-        <w:t>AuthResponse</w:t>
-      </w:r>
-      <w:proofErr w:type="spellEnd"/>
-      <w:r>
-        <w:t xml:space="preserve"> object </w:t>
+        <w:t xml:space="preserve">The AuthResponse object </w:t>
       </w:r>
       <w:r>
         <w:t>does not contain</w:t>
@@ -4462,15 +4132,7 @@
         </w:numPr>
       </w:pPr>
       <w:r>
-        <w:t xml:space="preserve">An </w:t>
-      </w:r>
-      <w:proofErr w:type="spellStart"/>
-      <w:r>
-        <w:t>AuthResponse</w:t>
-      </w:r>
-      <w:proofErr w:type="spellEnd"/>
-      <w:r>
-        <w:t xml:space="preserve"> object is returned.</w:t>
+        <w:t>An AuthResponse object is returned.</w:t>
       </w:r>
     </w:p>
     <w:p>
@@ -4482,15 +4144,7 @@
         </w:numPr>
       </w:pPr>
       <w:r>
-        <w:t xml:space="preserve">The </w:t>
-      </w:r>
-      <w:proofErr w:type="spellStart"/>
-      <w:r>
-        <w:t>AuthResponse</w:t>
-      </w:r>
-      <w:proofErr w:type="spellEnd"/>
-      <w:r>
-        <w:t xml:space="preserve"> object does not contain a token</w:t>
+        <w:t>The AuthResponse object does not contain a token</w:t>
       </w:r>
     </w:p>
     <w:p>
@@ -4503,15 +4157,7 @@
         <w:ind w:left="1800" w:firstLine="0"/>
       </w:pPr>
       <w:r>
-        <w:t xml:space="preserve">The </w:t>
-      </w:r>
-      <w:proofErr w:type="spellStart"/>
-      <w:r>
-        <w:t>AuthResponse</w:t>
-      </w:r>
-      <w:proofErr w:type="spellEnd"/>
-      <w:r>
-        <w:t xml:space="preserve"> object contains errors in its error list</w:t>
+        <w:t>The AuthResponse object contains errors in its error list</w:t>
       </w:r>
     </w:p>
     <w:p>
@@ -4534,13 +4180,8 @@
           <w:numId w:val="11"/>
         </w:numPr>
       </w:pPr>
-      <w:proofErr w:type="gramStart"/>
-      <w:r>
-        <w:t>Fail</w:t>
-      </w:r>
-      <w:proofErr w:type="gramEnd"/>
-      <w:r>
-        <w:t>:</w:t>
+      <w:r>
+        <w:t>Fail:</w:t>
       </w:r>
       <w:r>
         <w:tab/>
@@ -4555,15 +4196,7 @@
         </w:numPr>
       </w:pPr>
       <w:r>
-        <w:t xml:space="preserve">An </w:t>
-      </w:r>
-      <w:proofErr w:type="spellStart"/>
-      <w:r>
-        <w:t>AuthResponse</w:t>
-      </w:r>
-      <w:proofErr w:type="spellEnd"/>
-      <w:r>
-        <w:t xml:space="preserve"> object is not returned</w:t>
+        <w:t>An AuthResponse object is not returned</w:t>
       </w:r>
     </w:p>
     <w:p>
@@ -4575,15 +4208,7 @@
         </w:numPr>
       </w:pPr>
       <w:r>
-        <w:t xml:space="preserve">The </w:t>
-      </w:r>
-      <w:proofErr w:type="spellStart"/>
-      <w:r>
-        <w:t>AuthResponse</w:t>
-      </w:r>
-      <w:proofErr w:type="spellEnd"/>
-      <w:r>
-        <w:t xml:space="preserve"> object contains a token</w:t>
+        <w:t>The AuthResponse object contains a token</w:t>
       </w:r>
     </w:p>
     <w:p>
@@ -4595,15 +4220,7 @@
         </w:numPr>
       </w:pPr>
       <w:r>
-        <w:t xml:space="preserve">The </w:t>
-      </w:r>
-      <w:proofErr w:type="spellStart"/>
-      <w:r>
-        <w:t>AuthResponse</w:t>
-      </w:r>
-      <w:proofErr w:type="spellEnd"/>
-      <w:r>
-        <w:t xml:space="preserve"> object does not contain an error in its error list</w:t>
+        <w:t>The AuthResponse object does not contain an error in its error list</w:t>
       </w:r>
     </w:p>
     <w:p>
@@ -4649,15 +4266,7 @@
         </w:numPr>
       </w:pPr>
       <w:r>
-        <w:t xml:space="preserve">An </w:t>
-      </w:r>
-      <w:proofErr w:type="spellStart"/>
-      <w:r>
-        <w:t>AuthResponse</w:t>
-      </w:r>
-      <w:proofErr w:type="spellEnd"/>
-      <w:r>
-        <w:t xml:space="preserve"> object is returned.</w:t>
+        <w:t>An AuthResponse object is returned.</w:t>
       </w:r>
     </w:p>
     <w:p>
@@ -4669,15 +4278,7 @@
         </w:numPr>
       </w:pPr>
       <w:r>
-        <w:t xml:space="preserve">The </w:t>
-      </w:r>
-      <w:proofErr w:type="spellStart"/>
-      <w:r>
-        <w:t>AuthResponse</w:t>
-      </w:r>
-      <w:proofErr w:type="spellEnd"/>
-      <w:r>
-        <w:t xml:space="preserve"> object does not contain a token</w:t>
+        <w:t>The AuthResponse object does not contain a token</w:t>
       </w:r>
     </w:p>
     <w:p>
@@ -4690,26 +4291,10 @@
         <w:ind w:left="1800" w:firstLine="0"/>
       </w:pPr>
       <w:r>
-        <w:t xml:space="preserve">The </w:t>
-      </w:r>
-      <w:proofErr w:type="spellStart"/>
-      <w:r>
-        <w:t>AuthResponse</w:t>
-      </w:r>
-      <w:proofErr w:type="spellEnd"/>
-      <w:r>
-        <w:t xml:space="preserve"> object contains errors in its error list</w:t>
-      </w:r>
-      <w:r>
-        <w:t xml:space="preserve"> (The message that is returned can vary depending on what part of the password requirements the password does not </w:t>
-      </w:r>
-      <w:proofErr w:type="gramStart"/>
-      <w:r>
-        <w:t>meet,</w:t>
-      </w:r>
-      <w:proofErr w:type="gramEnd"/>
-      <w:r>
-        <w:t xml:space="preserve"> therefore, the message contents are not checked)</w:t>
+        <w:t>The AuthResponse object contains errors in its error list</w:t>
+      </w:r>
+      <w:r>
+        <w:t xml:space="preserve"> (The message that is returned can vary depending on what part of the password requirements the password does not meet, therefore, the message contents are not checked)</w:t>
       </w:r>
     </w:p>
     <w:p>
@@ -4720,14 +4305,9 @@
           <w:numId w:val="11"/>
         </w:numPr>
       </w:pPr>
-      <w:proofErr w:type="gramStart"/>
       <w:r>
         <w:lastRenderedPageBreak/>
-        <w:t>Fail</w:t>
-      </w:r>
-      <w:proofErr w:type="gramEnd"/>
-      <w:r>
-        <w:t>:</w:t>
+        <w:t>Fail:</w:t>
       </w:r>
       <w:r>
         <w:tab/>
@@ -4742,15 +4322,7 @@
         </w:numPr>
       </w:pPr>
       <w:r>
-        <w:t xml:space="preserve">An </w:t>
-      </w:r>
-      <w:proofErr w:type="spellStart"/>
-      <w:r>
-        <w:t>AuthResponse</w:t>
-      </w:r>
-      <w:proofErr w:type="spellEnd"/>
-      <w:r>
-        <w:t xml:space="preserve"> object is not returned</w:t>
+        <w:t>An AuthResponse object is not returned</w:t>
       </w:r>
     </w:p>
     <w:p>
@@ -4762,15 +4334,7 @@
         </w:numPr>
       </w:pPr>
       <w:r>
-        <w:t xml:space="preserve">The </w:t>
-      </w:r>
-      <w:proofErr w:type="spellStart"/>
-      <w:r>
-        <w:t>AuthResponse</w:t>
-      </w:r>
-      <w:proofErr w:type="spellEnd"/>
-      <w:r>
-        <w:t xml:space="preserve"> object contains a token</w:t>
+        <w:t>The AuthResponse object contains a token</w:t>
       </w:r>
     </w:p>
     <w:p>
@@ -4782,15 +4346,7 @@
         </w:numPr>
       </w:pPr>
       <w:r>
-        <w:t xml:space="preserve">The </w:t>
-      </w:r>
-      <w:proofErr w:type="spellStart"/>
-      <w:r>
-        <w:t>AuthResponse</w:t>
-      </w:r>
-      <w:proofErr w:type="spellEnd"/>
-      <w:r>
-        <w:t xml:space="preserve"> object does not contain an error in its error list</w:t>
+        <w:t>The AuthResponse object does not contain an error in its error list</w:t>
       </w:r>
     </w:p>
     <w:p>
@@ -5317,214 +4873,59 @@
       <w:r>
         <w:lastRenderedPageBreak/>
         <w:tab/>
-      </w:r>
-      <w:proofErr w:type="spellStart"/>
-      <w:r>
-        <w:t>BadPassword</w:t>
-      </w:r>
-      <w:proofErr w:type="spellEnd"/>
-      <w:r>
-        <w:t xml:space="preserve"> – This test is to ensure that an account creation with a “bad password” or a password that does not meet the password requirements </w:t>
-      </w:r>
-      <w:proofErr w:type="gramStart"/>
-      <w:r>
-        <w:t>does not succeed</w:t>
-      </w:r>
-      <w:proofErr w:type="gramEnd"/>
-      <w:r>
-        <w:t xml:space="preserve">. This Test passed, as an </w:t>
-      </w:r>
-      <w:proofErr w:type="spellStart"/>
-      <w:r>
-        <w:t>AuthResponse</w:t>
-      </w:r>
-      <w:proofErr w:type="spellEnd"/>
-      <w:r>
-        <w:t xml:space="preserve"> object was returned to the caller. The </w:t>
-      </w:r>
-      <w:proofErr w:type="spellStart"/>
-      <w:r>
-        <w:t>AuthResponse</w:t>
-      </w:r>
-      <w:proofErr w:type="spellEnd"/>
-      <w:r>
-        <w:t xml:space="preserve"> object did not contain any authentication </w:t>
-      </w:r>
-      <w:proofErr w:type="gramStart"/>
-      <w:r>
-        <w:t>Token, but</w:t>
-      </w:r>
-      <w:proofErr w:type="gramEnd"/>
-      <w:r>
-        <w:t xml:space="preserve"> did contain </w:t>
+        <w:t xml:space="preserve">BadPassword – This test is to ensure that an account creation with a “bad password” or a password that does not meet the password requirements does not succeed. This Test passed, as an AuthResponse object was returned to the caller. The AuthResponse object did not contain any authentication Token, but did contain </w:t>
       </w:r>
       <w:r>
         <w:t>errors in the object’s error list.</w:t>
       </w:r>
     </w:p>
     <w:p>
-      <w:proofErr w:type="spellStart"/>
       <w:r>
         <w:t>BlankLogin</w:t>
       </w:r>
-      <w:proofErr w:type="spellEnd"/>
       <w:r>
         <w:t xml:space="preserve"> – This test is run to ensure that a login attempt with no credentials does not cause any issues and is unable to login. This Test passed, as null was returned to the caller as required by the test pass requirements as outlined above.</w:t>
       </w:r>
     </w:p>
     <w:p>
-      <w:proofErr w:type="spellStart"/>
       <w:r>
         <w:t>BlankPassword</w:t>
       </w:r>
-      <w:proofErr w:type="spellEnd"/>
-      <w:r>
-        <w:t xml:space="preserve"> - This test is to ensure that an account creation with no password </w:t>
-      </w:r>
-      <w:proofErr w:type="gramStart"/>
-      <w:r>
-        <w:t>does not succeed</w:t>
-      </w:r>
-      <w:proofErr w:type="gramEnd"/>
-      <w:r>
-        <w:t xml:space="preserve">. This Test passed, as an </w:t>
-      </w:r>
-      <w:proofErr w:type="spellStart"/>
-      <w:r>
-        <w:t>AuthResponse</w:t>
-      </w:r>
-      <w:proofErr w:type="spellEnd"/>
-      <w:r>
-        <w:t xml:space="preserve"> object was returned to the caller. The </w:t>
-      </w:r>
-      <w:proofErr w:type="spellStart"/>
-      <w:r>
-        <w:t>AuthResponse</w:t>
-      </w:r>
-      <w:proofErr w:type="spellEnd"/>
-      <w:r>
-        <w:t xml:space="preserve"> object did not contain any authentication </w:t>
-      </w:r>
-      <w:proofErr w:type="gramStart"/>
-      <w:r>
-        <w:t>Token, but</w:t>
-      </w:r>
-      <w:proofErr w:type="gramEnd"/>
-      <w:r>
-        <w:t xml:space="preserve"> did contain errors in the object’s error list.</w:t>
-      </w:r>
-    </w:p>
-    <w:p>
-      <w:proofErr w:type="spellStart"/>
+      <w:r>
+        <w:t xml:space="preserve"> - This test is to ensure that an account creation with no password does not succeed. This Test passed, as an AuthResponse object was returned to the caller. The AuthResponse object did not contain any authentication Token, but did contain errors in the object’s error list.</w:t>
+      </w:r>
+    </w:p>
+    <w:p>
       <w:r>
         <w:t>DuplicateEmail</w:t>
       </w:r>
-      <w:proofErr w:type="spellEnd"/>
-      <w:r>
-        <w:t xml:space="preserve"> – This test is to ensure that an account cannot be created that has the same email address as another account. This test passed, as an </w:t>
-      </w:r>
-      <w:proofErr w:type="spellStart"/>
-      <w:r>
-        <w:t>AuthResponse</w:t>
-      </w:r>
-      <w:proofErr w:type="spellEnd"/>
-      <w:r>
-        <w:t xml:space="preserve"> object was returned to the caller. The </w:t>
-      </w:r>
-      <w:proofErr w:type="spellStart"/>
-      <w:r>
-        <w:t>AuthResponse</w:t>
-      </w:r>
-      <w:proofErr w:type="spellEnd"/>
-      <w:r>
-        <w:t xml:space="preserve"> object did not have an authorization </w:t>
-      </w:r>
-      <w:proofErr w:type="gramStart"/>
-      <w:r>
-        <w:t>token, but</w:t>
-      </w:r>
-      <w:proofErr w:type="gramEnd"/>
-      <w:r>
-        <w:t xml:space="preserve"> did contain the necessary error notifying the caller of an email conflict.</w:t>
-      </w:r>
-    </w:p>
-    <w:p>
-      <w:proofErr w:type="spellStart"/>
+      <w:r>
+        <w:t xml:space="preserve"> – This test is to ensure that an account cannot be created that has the same email address as another account. This test passed, as an AuthResponse object was returned to the caller. The AuthResponse object did not have an authorization token, but did contain the necessary error notifying the caller of an email conflict.</w:t>
+      </w:r>
+    </w:p>
+    <w:p>
       <w:r>
         <w:t>DuplicateUsername</w:t>
       </w:r>
-      <w:proofErr w:type="spellEnd"/>
-      <w:r>
-        <w:t xml:space="preserve"> – This test is to ensure that an account cannot be created that has the same username as another account. This test passed, as an </w:t>
-      </w:r>
-      <w:proofErr w:type="spellStart"/>
-      <w:r>
-        <w:t>AuthResponse</w:t>
-      </w:r>
-      <w:proofErr w:type="spellEnd"/>
-      <w:r>
-        <w:t xml:space="preserve"> object was returned to the caller. The </w:t>
-      </w:r>
-      <w:proofErr w:type="spellStart"/>
-      <w:r>
-        <w:t>AuthResponse</w:t>
-      </w:r>
-      <w:proofErr w:type="spellEnd"/>
-      <w:r>
-        <w:t xml:space="preserve"> object did not have an authorization </w:t>
-      </w:r>
-      <w:proofErr w:type="gramStart"/>
-      <w:r>
-        <w:t>token, but</w:t>
-      </w:r>
-      <w:proofErr w:type="gramEnd"/>
-      <w:r>
-        <w:t xml:space="preserve"> did contain the necessary error notifying the caller of a username conflict.</w:t>
-      </w:r>
-    </w:p>
-    <w:p>
-      <w:proofErr w:type="spellStart"/>
+      <w:r>
+        <w:t xml:space="preserve"> – This test is to ensure that an account cannot be created that has the same username as another account. This test passed, as an AuthResponse object was returned to the caller. The AuthResponse object did not have an authorization token, but did contain the necessary error notifying the caller of a username conflict.</w:t>
+      </w:r>
+    </w:p>
+    <w:p>
       <w:r>
         <w:t>RegisterUser</w:t>
       </w:r>
-      <w:proofErr w:type="spellEnd"/>
-      <w:r>
-        <w:t xml:space="preserve"> – This test is to ensure that the user registration method functions as expected allowing a new user to create and account and receive an authorization token. The test passed as the method returned an </w:t>
-      </w:r>
-      <w:proofErr w:type="spellStart"/>
-      <w:r>
-        <w:t>AuthResponse</w:t>
-      </w:r>
-      <w:proofErr w:type="spellEnd"/>
-      <w:r>
-        <w:t xml:space="preserve"> object that contained the proper authorization token and did not contain any errors in the objects error list.</w:t>
-      </w:r>
-    </w:p>
-    <w:p>
-      <w:proofErr w:type="spellStart"/>
+      <w:r>
+        <w:t xml:space="preserve"> – This test is to ensure that the user registration method functions as expected allowing a new user to create and account and receive an authorization token. The test passed as the method returned an AuthResponse object that contained the proper authorization token and did not contain any errors in the objects error list.</w:t>
+      </w:r>
+    </w:p>
+    <w:p>
       <w:r>
         <w:lastRenderedPageBreak/>
         <w:t>SuccessfulLogin</w:t>
       </w:r>
-      <w:proofErr w:type="spellEnd"/>
-      <w:r>
-        <w:t xml:space="preserve"> - This test is to ensure that a user </w:t>
-      </w:r>
-      <w:proofErr w:type="gramStart"/>
-      <w:r>
-        <w:t>is able to</w:t>
-      </w:r>
-      <w:proofErr w:type="gramEnd"/>
-      <w:r>
-        <w:t xml:space="preserve"> log in with proper credentials as expected and receive an authorization token. The test passed as the method returned an </w:t>
-      </w:r>
-      <w:proofErr w:type="spellStart"/>
-      <w:r>
-        <w:t>AuthResponse</w:t>
-      </w:r>
-      <w:proofErr w:type="spellEnd"/>
-      <w:r>
-        <w:t xml:space="preserve"> object that contained the proper authorization token and did not contain any errors in the objects error list.</w:t>
+      <w:r>
+        <w:t xml:space="preserve"> - This test is to ensure that a user is able to log in with proper credentials as expected and receive an authorization token. The test passed as the method returned an AuthResponse object that contained the proper authorization token and did not contain any errors in the objects error list.</w:t>
       </w:r>
     </w:p>
     <w:p>
@@ -5653,16 +5054,11 @@
       <w:r>
         <w:t xml:space="preserve">open </w:t>
       </w:r>
-      <w:proofErr w:type="spellStart"/>
       <w:r>
         <w:t>MediaBacklogManagerBackend</w:t>
       </w:r>
       <w:r>
-        <w:t>.slnx</w:t>
-      </w:r>
-      <w:proofErr w:type="spellEnd"/>
-      <w:r>
-        <w:t xml:space="preserve"> in Visual Studio</w:t>
+        <w:t>.slnx in Visual Studio</w:t>
       </w:r>
     </w:p>
     <w:p>
@@ -5673,33 +5069,15 @@
           <w:numId w:val="17"/>
         </w:numPr>
       </w:pPr>
-      <w:proofErr w:type="gramStart"/>
-      <w:r>
-        <w:t>the</w:t>
-      </w:r>
-      <w:proofErr w:type="gramEnd"/>
-      <w:r>
-        <w:t xml:space="preserve"> </w:t>
-      </w:r>
-      <w:r>
-        <w:t xml:space="preserve">file </w:t>
-      </w:r>
-      <w:proofErr w:type="gramStart"/>
-      <w:r>
-        <w:t>is located in</w:t>
-      </w:r>
-      <w:proofErr w:type="gramEnd"/>
-      <w:r>
-        <w:t xml:space="preserve"> </w:t>
-      </w:r>
-      <w:r>
-        <w:t>\backend\</w:t>
-      </w:r>
-      <w:proofErr w:type="spellStart"/>
-      <w:r>
-        <w:t>MediaBacklogManagerBackend</w:t>
-      </w:r>
-      <w:proofErr w:type="spellEnd"/>
+      <w:r>
+        <w:t xml:space="preserve">the </w:t>
+      </w:r>
+      <w:r>
+        <w:t xml:space="preserve">file is located in </w:t>
+      </w:r>
+      <w:r>
+        <w:t>\backend\MediaBacklogManagerBackend</w:t>
+      </w:r>
     </w:p>
     <w:p>
       <w:pPr>
@@ -5721,21 +5099,8 @@
           <w:numId w:val="17"/>
         </w:numPr>
       </w:pPr>
-      <w:proofErr w:type="spellStart"/>
-      <w:r>
-        <w:t>MediaBacklogManager.Tests</w:t>
-      </w:r>
-      <w:proofErr w:type="spellEnd"/>
-      <w:r>
-        <w:t xml:space="preserve"> is the </w:t>
-      </w:r>
-      <w:proofErr w:type="spellStart"/>
-      <w:r>
-        <w:t>xUnit</w:t>
-      </w:r>
-      <w:proofErr w:type="spellEnd"/>
-      <w:r>
-        <w:t xml:space="preserve"> project that is used for running unit tests</w:t>
+      <w:r>
+        <w:t>MediaBacklogManager.Tests is the xUnit project that is used for running unit tests</w:t>
       </w:r>
     </w:p>
     <w:p>
@@ -5746,13 +5111,8 @@
           <w:numId w:val="17"/>
         </w:numPr>
       </w:pPr>
-      <w:proofErr w:type="spellStart"/>
-      <w:r>
-        <w:t>MediaBacklogManagerBackend</w:t>
-      </w:r>
-      <w:proofErr w:type="spellEnd"/>
-      <w:r>
-        <w:t xml:space="preserve"> is the ASP.net backend API project.</w:t>
+      <w:r>
+        <w:t>MediaBacklogManagerBackend is the ASP.net backend API project.</w:t>
       </w:r>
     </w:p>
     <w:p>
@@ -5821,51 +5181,20 @@
         <w:t xml:space="preserve">Visual Studio should automatically download and install any necessary NuGet packages, but if it is unable to do so, you can navigate to the </w:t>
       </w:r>
       <w:r>
-        <w:t>\backend\</w:t>
-      </w:r>
-      <w:proofErr w:type="spellStart"/>
-      <w:r>
-        <w:t>MediaBacklogManagerBackend</w:t>
-      </w:r>
-      <w:proofErr w:type="spellEnd"/>
-      <w:r>
-        <w:t>\</w:t>
-      </w:r>
-      <w:proofErr w:type="spellStart"/>
-      <w:r>
-        <w:t>MediaBacklogManagerBackend</w:t>
-      </w:r>
-      <w:proofErr w:type="spellEnd"/>
-      <w:r>
-        <w:t xml:space="preserve"> and </w:t>
-      </w:r>
-      <w:r>
-        <w:t>\backend\</w:t>
-      </w:r>
-      <w:proofErr w:type="spellStart"/>
-      <w:r>
-        <w:t>MediaBacklogManagerBackend</w:t>
-      </w:r>
-      <w:proofErr w:type="spellEnd"/>
-      <w:r>
-        <w:t>\</w:t>
-      </w:r>
-      <w:proofErr w:type="spellStart"/>
-      <w:r>
-        <w:t>MediaBacklogManager.Tests</w:t>
-      </w:r>
-      <w:proofErr w:type="spellEnd"/>
-      <w:r>
-        <w:t xml:space="preserve"> folder</w:t>
-      </w:r>
-      <w:r>
-        <w:t xml:space="preserve"> in </w:t>
-      </w:r>
-      <w:proofErr w:type="spellStart"/>
-      <w:r>
-        <w:t>powershell</w:t>
-      </w:r>
-      <w:proofErr w:type="spellEnd"/>
+        <w:t>\backend\MediaBacklogManagerBackend</w:t>
+      </w:r>
+      <w:r>
+        <w:t xml:space="preserve">\MediaBacklogManagerBackend and </w:t>
+      </w:r>
+      <w:r>
+        <w:t>\backend\MediaBacklogManagerBackend</w:t>
+      </w:r>
+      <w:r>
+        <w:t>\MediaBacklogManager.Tests folder</w:t>
+      </w:r>
+      <w:r>
+        <w:t xml:space="preserve"> in powershell</w:t>
+      </w:r>
       <w:r>
         <w:t xml:space="preserve"> and run “dotnet restore” to manually download and install the necessary NuGet packages.</w:t>
       </w:r>
@@ -5888,15 +5217,7 @@
         </w:numPr>
       </w:pPr>
       <w:r>
-        <w:t xml:space="preserve">The angular frontend root folder is </w:t>
-      </w:r>
-      <w:proofErr w:type="gramStart"/>
-      <w:r>
-        <w:t>locate</w:t>
-      </w:r>
-      <w:proofErr w:type="gramEnd"/>
-      <w:r>
-        <w:t xml:space="preserve"> at </w:t>
+        <w:t xml:space="preserve">The angular frontend root folder is locate at </w:t>
       </w:r>
       <w:r>
         <w:t>frontend\media-backlog-frontend</w:t>
@@ -5935,15 +5256,7 @@
         <w:t>PowerShell</w:t>
       </w:r>
       <w:r>
-        <w:t xml:space="preserve"> and run “</w:t>
-      </w:r>
-      <w:proofErr w:type="spellStart"/>
-      <w:r>
-        <w:t>npm</w:t>
-      </w:r>
-      <w:proofErr w:type="spellEnd"/>
-      <w:r>
-        <w:t xml:space="preserve"> install”</w:t>
+        <w:t xml:space="preserve"> and run “npm install”</w:t>
       </w:r>
     </w:p>
     <w:p>
@@ -5986,23 +5299,7 @@
     </w:p>
     <w:p>
       <w:r>
-        <w:t xml:space="preserve">A development account is created by default using the credentials stored in the </w:t>
-      </w:r>
-      <w:proofErr w:type="spellStart"/>
-      <w:r>
-        <w:t>appsettings.json</w:t>
-      </w:r>
-      <w:proofErr w:type="spellEnd"/>
-      <w:r>
-        <w:t xml:space="preserve"> file in the </w:t>
-      </w:r>
-      <w:proofErr w:type="spellStart"/>
-      <w:r>
-        <w:t>MediaBacklogManagerBackend</w:t>
-      </w:r>
-      <w:proofErr w:type="spellEnd"/>
-      <w:r>
-        <w:t xml:space="preserve"> project. These Credentials can be changed as needed.</w:t>
+        <w:t>A development account is created by default using the credentials stored in the appsettings.json file in the MediaBacklogManagerBackend project. These Credentials can be changed as needed.</w:t>
       </w:r>
     </w:p>
     <w:p>
@@ -6280,15 +5577,7 @@
         </w:numPr>
       </w:pPr>
       <w:r>
-        <w:t xml:space="preserve">Click </w:t>
-      </w:r>
-      <w:proofErr w:type="gramStart"/>
-      <w:r>
-        <w:t>manage</w:t>
-      </w:r>
-      <w:proofErr w:type="gramEnd"/>
-      <w:r>
-        <w:t xml:space="preserve"> deployment token at the top of the page and then copy the deployment token.</w:t>
+        <w:t>Click manage deployment token at the top of the page and then copy the deployment token.</w:t>
       </w:r>
     </w:p>
     <w:p>
@@ -6376,15 +5665,7 @@
       </w:pPr>
       <w:r>
         <w:lastRenderedPageBreak/>
-        <w:t xml:space="preserve">Hit </w:t>
-      </w:r>
-      <w:proofErr w:type="gramStart"/>
-      <w:r>
-        <w:t>save</w:t>
-      </w:r>
-      <w:proofErr w:type="gramEnd"/>
-      <w:r>
-        <w:t>.</w:t>
+        <w:t>Hit save.</w:t>
       </w:r>
     </w:p>
     <w:p>
@@ -6396,18 +5677,11 @@
         </w:numPr>
       </w:pPr>
       <w:r>
-        <w:t xml:space="preserve">Ensure the </w:t>
-      </w:r>
-      <w:proofErr w:type="gramStart"/>
-      <w:r>
-        <w:t>“.</w:t>
-      </w:r>
-      <w:proofErr w:type="spellStart"/>
+        <w:t>Ensure the “.</w:t>
+      </w:r>
       <w:r>
         <w:t>gitlab-ci.yml</w:t>
       </w:r>
-      <w:proofErr w:type="spellEnd"/>
-      <w:proofErr w:type="gramEnd"/>
       <w:r>
         <w:t>” file is in the repository root. – this will allow GitLab to connect to azure and automatically deploy the application.</w:t>
       </w:r>
@@ -6565,15 +5839,7 @@
         </w:numPr>
       </w:pPr>
       <w:r>
-        <w:t xml:space="preserve">In the </w:t>
-      </w:r>
-      <w:proofErr w:type="gramStart"/>
-      <w:r>
-        <w:t>publish</w:t>
-      </w:r>
-      <w:proofErr w:type="gramEnd"/>
-      <w:r>
-        <w:t xml:space="preserve"> field, select Code</w:t>
+        <w:t>In the publish field, select Code</w:t>
       </w:r>
     </w:p>
     <w:p>
@@ -6609,15 +5875,7 @@
         </w:numPr>
       </w:pPr>
       <w:r>
-        <w:t xml:space="preserve">Pick a region (I did East US 2. If you receive an error about a quota you may need to ensure that you have available VMs in your quota for whichever pricing and </w:t>
-      </w:r>
-      <w:proofErr w:type="gramStart"/>
-      <w:r>
-        <w:t>location</w:t>
-      </w:r>
-      <w:proofErr w:type="gramEnd"/>
-      <w:r>
-        <w:t xml:space="preserve"> you are using.)</w:t>
+        <w:t>Pick a region (I did East US 2. If you receive an error about a quota you may need to ensure that you have available VMs in your quota for whichever pricing and location you are using.)</w:t>
       </w:r>
     </w:p>
     <w:p>
@@ -6779,15 +6037,7 @@
         </w:numPr>
       </w:pPr>
       <w:r>
-        <w:t xml:space="preserve">Press </w:t>
-      </w:r>
-      <w:proofErr w:type="gramStart"/>
-      <w:r>
-        <w:t>apply</w:t>
-      </w:r>
-      <w:proofErr w:type="gramEnd"/>
-      <w:r>
-        <w:t>.</w:t>
+        <w:t>Press apply.</w:t>
       </w:r>
     </w:p>
     <w:p>
@@ -6888,13 +6138,8 @@
           <w:numId w:val="13"/>
         </w:numPr>
       </w:pPr>
-      <w:proofErr w:type="spellStart"/>
-      <w:r>
-        <w:t>Jwt</w:t>
-      </w:r>
-      <w:proofErr w:type="spellEnd"/>
-      <w:r>
-        <w:t>__Key</w:t>
+      <w:r>
+        <w:t>Jwt__Key</w:t>
       </w:r>
     </w:p>
     <w:p>
@@ -6917,13 +6162,8 @@
           <w:numId w:val="13"/>
         </w:numPr>
       </w:pPr>
-      <w:proofErr w:type="spellStart"/>
-      <w:r>
-        <w:t>Jwt</w:t>
-      </w:r>
-      <w:proofErr w:type="spellEnd"/>
-      <w:r>
-        <w:t>__Issuer</w:t>
+      <w:r>
+        <w:t>Jwt__Issuer</w:t>
       </w:r>
     </w:p>
     <w:p>
@@ -6946,14 +6186,9 @@
           <w:numId w:val="13"/>
         </w:numPr>
       </w:pPr>
-      <w:proofErr w:type="spellStart"/>
       <w:r>
         <w:lastRenderedPageBreak/>
-        <w:t>Jwt</w:t>
-      </w:r>
-      <w:proofErr w:type="spellEnd"/>
-      <w:r>
-        <w:t>__Audience</w:t>
+        <w:t>Jwt__Audience</w:t>
       </w:r>
     </w:p>
     <w:p>
@@ -6976,11 +6211,9 @@
           <w:numId w:val="13"/>
         </w:numPr>
       </w:pPr>
-      <w:proofErr w:type="spellStart"/>
       <w:r>
         <w:t>User__Username</w:t>
       </w:r>
-      <w:proofErr w:type="spellEnd"/>
     </w:p>
     <w:p>
       <w:pPr>
@@ -6990,11 +6223,9 @@
           <w:numId w:val="13"/>
         </w:numPr>
       </w:pPr>
-      <w:proofErr w:type="spellStart"/>
       <w:r>
         <w:t>User__Password</w:t>
       </w:r>
-      <w:proofErr w:type="spellEnd"/>
     </w:p>
     <w:p>
       <w:pPr>
@@ -7019,11 +6250,9 @@
       <w:r>
         <w:t>Name: “</w:t>
       </w:r>
-      <w:proofErr w:type="spellStart"/>
       <w:r>
         <w:t>DefaultConnection</w:t>
       </w:r>
-      <w:proofErr w:type="spellEnd"/>
       <w:r>
         <w:t>”</w:t>
       </w:r>
@@ -7037,21 +6266,11 @@
         </w:numPr>
       </w:pPr>
       <w:r>
-        <w:t>Value</w:t>
-      </w:r>
-      <w:proofErr w:type="gramStart"/>
-      <w:r>
-        <w:t>: ”</w:t>
-      </w:r>
-      <w:proofErr w:type="gramEnd"/>
-      <w:r>
-        <w:t>D:\home\data\</w:t>
-      </w:r>
-      <w:proofErr w:type="spellStart"/>
-      <w:r>
-        <w:t>BacklogManager.db</w:t>
-      </w:r>
-      <w:proofErr w:type="spellEnd"/>
+        <w:t>Value: ”</w:t>
+      </w:r>
+      <w:r>
+        <w:t>D:\home\data\BacklogManager.db</w:t>
+      </w:r>
       <w:r>
         <w:t>”</w:t>
       </w:r>
@@ -7160,15 +6379,7 @@
       </w:pPr>
       <w:r>
         <w:lastRenderedPageBreak/>
-        <w:t xml:space="preserve">Value: Paste the contents from the </w:t>
-      </w:r>
-      <w:proofErr w:type="gramStart"/>
-      <w:r>
-        <w:t>publish</w:t>
-      </w:r>
-      <w:proofErr w:type="gramEnd"/>
-      <w:r>
-        <w:t xml:space="preserve"> profile file that was downloaded in step 15</w:t>
+        <w:t>Value: Paste the contents from the publish profile file that was downloaded in step 15</w:t>
       </w:r>
     </w:p>
     <w:p>
@@ -7179,13 +6390,8 @@
           <w:numId w:val="13"/>
         </w:numPr>
       </w:pPr>
-      <w:proofErr w:type="gramStart"/>
-      <w:r>
-        <w:t>Hit</w:t>
-      </w:r>
-      <w:proofErr w:type="gramEnd"/>
-      <w:r>
-        <w:t xml:space="preserve"> Save.</w:t>
+      <w:r>
+        <w:t>Hit Save.</w:t>
       </w:r>
     </w:p>
     <w:p>
@@ -7258,15 +6464,7 @@
         </w:numPr>
       </w:pPr>
       <w:r>
-        <w:t xml:space="preserve">Paste the URL from the frontend into the </w:t>
-      </w:r>
-      <w:proofErr w:type="spellStart"/>
-      <w:r>
-        <w:t>Program.cs</w:t>
-      </w:r>
-      <w:proofErr w:type="spellEnd"/>
-      <w:r>
-        <w:t xml:space="preserve"> file in the ASP.net project. The URL needs to be placed in the CORS options. Currently around line 75 (This file is located at </w:t>
+        <w:t xml:space="preserve">Paste the URL from the frontend into the Program.cs file in the ASP.net project. The URL needs to be placed in the CORS options. Currently around line 75 (This file is located at </w:t>
       </w:r>
       <w:r>
         <w:t>backend\MediaBacklogManagerBackend\MediaBacklogManagerBackend\Program.cs</w:t>
@@ -7324,39 +6522,7 @@
         <w:ind w:left="360" w:firstLine="0"/>
       </w:pPr>
       <w:r>
-        <w:t xml:space="preserve">Paste the URL From the backend into the </w:t>
-      </w:r>
-      <w:proofErr w:type="spellStart"/>
-      <w:r>
-        <w:t>environment.ts</w:t>
-      </w:r>
-      <w:proofErr w:type="spellEnd"/>
-      <w:r>
-        <w:t xml:space="preserve"> file in the angular project. This file is located at: frontend/media-backlog-frontend/</w:t>
-      </w:r>
-      <w:proofErr w:type="spellStart"/>
-      <w:r>
-        <w:t>src</w:t>
-      </w:r>
-      <w:proofErr w:type="spellEnd"/>
-      <w:r>
-        <w:t>/environments/</w:t>
-      </w:r>
-      <w:proofErr w:type="spellStart"/>
-      <w:r>
-        <w:t>environment.ts</w:t>
-      </w:r>
-      <w:proofErr w:type="spellEnd"/>
-      <w:r>
-        <w:t>. The URL should include /</w:t>
-      </w:r>
-      <w:proofErr w:type="spellStart"/>
-      <w:r>
-        <w:t>api</w:t>
-      </w:r>
-      <w:proofErr w:type="spellEnd"/>
-      <w:r>
-        <w:t xml:space="preserve"> at the end as this is the base Api endpoint the application builds its Api URLs on.</w:t>
+        <w:t>Paste the URL From the backend into the environment.ts file in the angular project. This file is located at: frontend/media-backlog-frontend/src/environments/environment.ts. The URL should include /api at the end as this is the base Api endpoint the application builds its Api URLs on.</w:t>
       </w:r>
     </w:p>
     <w:p>
@@ -7454,15 +6620,16 @@
     </w:p>
     <w:p>
       <w:r>
-        <w:t>Provided below is documentation for how to use the ap</w:t>
-      </w:r>
-    </w:p>
-    <w:p>
-      <w:r>
-        <w:t xml:space="preserve">plication. This information is intended to allow a new user of the application to open the application and perform all functions available within the application. </w:t>
-      </w:r>
-      <w:r>
-        <w:t>Because the application is web based not install is required by the user. The only thing required by the user</w:t>
+        <w:t xml:space="preserve">Provided below is documentation for how to use the application. This information is intended to allow a new user of the application to open the application and perform all functions available within the application. </w:t>
+      </w:r>
+      <w:r>
+        <w:t>Because the application is web based</w:t>
+      </w:r>
+      <w:r>
+        <w:t>,</w:t>
+      </w:r>
+      <w:r>
+        <w:t xml:space="preserve"> no install is required by the user. The only thing required by the user</w:t>
       </w:r>
       <w:r>
         <w:t xml:space="preserve"> is to navigate to the webpage where the application is hosted. Due to the applications web hosted nature, this </w:t>
@@ -7500,15 +6667,7 @@
         </w:numPr>
       </w:pPr>
       <w:r>
-        <w:t xml:space="preserve">To open the </w:t>
-      </w:r>
-      <w:proofErr w:type="gramStart"/>
-      <w:r>
-        <w:t>application</w:t>
-      </w:r>
-      <w:proofErr w:type="gramEnd"/>
-      <w:r>
-        <w:t xml:space="preserve"> navigate to the application’s web page</w:t>
+        <w:t>To open the application navigate to the application’s web page</w:t>
       </w:r>
     </w:p>
     <w:p>
@@ -7556,15 +6715,7 @@
         </w:numPr>
       </w:pPr>
       <w:r>
-        <w:t xml:space="preserve">Click on the “Create Account” button in the bottom </w:t>
-      </w:r>
-      <w:proofErr w:type="gramStart"/>
-      <w:r>
-        <w:t>right hand</w:t>
-      </w:r>
-      <w:proofErr w:type="gramEnd"/>
-      <w:r>
-        <w:t xml:space="preserve"> corner of the login screen. </w:t>
+        <w:t xml:space="preserve">Click on the “Create Account” button in the bottom right hand corner of the login screen. </w:t>
       </w:r>
     </w:p>
     <w:p>
@@ -7576,15 +6727,15 @@
         </w:numPr>
       </w:pPr>
       <w:r>
+        <w:t>The application should automatically route you to this screen</w:t>
+      </w:r>
+    </w:p>
+    <w:p>
+      <w:pPr>
+        <w:pStyle w:val="ListParagraph"/>
+      </w:pPr>
+      <w:r>
         <w:lastRenderedPageBreak/>
-        <w:t>The application should automatically route you to this screen</w:t>
-      </w:r>
-    </w:p>
-    <w:p>
-      <w:pPr>
-        <w:pStyle w:val="ListParagraph"/>
-      </w:pPr>
-      <w:r>
         <w:drawing>
           <wp:inline distT="0" distB="0" distL="0" distR="0" wp14:anchorId="6C211299" wp14:editId="0A7E5D47">
             <wp:extent cx="3651813" cy="2002645"/>
@@ -7745,7 +6896,6 @@
         </w:numPr>
       </w:pPr>
       <w:r>
-        <w:lastRenderedPageBreak/>
         <w:t xml:space="preserve">Press “Create Account” </w:t>
       </w:r>
     </w:p>
@@ -7758,6 +6908,7 @@
         </w:numPr>
       </w:pPr>
       <w:r>
+        <w:lastRenderedPageBreak/>
         <w:t>You will be notified if there are any conflicts with your username or email or if there are issues with your password.</w:t>
       </w:r>
     </w:p>
@@ -8236,7 +7387,13 @@
         </w:numPr>
       </w:pPr>
       <w:r>
-        <w:t>Press The create Game Button</w:t>
+        <w:t xml:space="preserve">Press </w:t>
+      </w:r>
+      <w:r>
+        <w:t>the create b</w:t>
+      </w:r>
+      <w:r>
+        <w:t>utton</w:t>
       </w:r>
     </w:p>
     <w:p>
@@ -8411,13 +7568,8 @@
           <w:numId w:val="23"/>
         </w:numPr>
       </w:pPr>
-      <w:proofErr w:type="gramStart"/>
-      <w:r>
-        <w:t>First</w:t>
-      </w:r>
-      <w:proofErr w:type="gramEnd"/>
-      <w:r>
-        <w:t xml:space="preserve"> you can quickly toggle the priority status of an item by clicking on the star in the top right corner of the media view card</w:t>
+      <w:r>
+        <w:t>First you can quickly toggle the priority status of an item by clicking on the star in the top right corner of the media view card</w:t>
       </w:r>
     </w:p>
     <w:p>
@@ -8551,23 +7703,7 @@
         </w:numPr>
       </w:pPr>
       <w:r>
-        <w:t xml:space="preserve">This </w:t>
-      </w:r>
-      <w:proofErr w:type="gramStart"/>
-      <w:r>
-        <w:t>edit</w:t>
-      </w:r>
-      <w:proofErr w:type="gramEnd"/>
-      <w:r>
-        <w:t xml:space="preserve"> form behaves in the same way as the media creation page. For </w:t>
-      </w:r>
-      <w:proofErr w:type="gramStart"/>
-      <w:r>
-        <w:t>instructions</w:t>
-      </w:r>
-      <w:proofErr w:type="gramEnd"/>
-      <w:r>
-        <w:t xml:space="preserve"> please see the “Adding an Item to Your Backlog” section</w:t>
+        <w:t>This edit form behaves in the same way as the media creation page. For instructions please see the “Adding an Item to Your Backlog” section</w:t>
       </w:r>
     </w:p>
     <w:p>
@@ -8636,14 +7772,9 @@
           <w:numId w:val="24"/>
         </w:numPr>
       </w:pPr>
-      <w:proofErr w:type="gramStart"/>
       <w:r>
         <w:lastRenderedPageBreak/>
-        <w:t>First</w:t>
-      </w:r>
-      <w:proofErr w:type="gramEnd"/>
-      <w:r>
-        <w:t xml:space="preserve"> you can search at any time by using the search bar available in the nav bar.</w:t>
+        <w:t>First you can search at any time by using the search bar available in the nav bar.</w:t>
       </w:r>
     </w:p>
     <w:p>
@@ -8697,7 +7828,13 @@
         </w:numPr>
       </w:pPr>
       <w:r>
-        <w:t>To use this search bar just type in the term that you would like to search then press enter or click the search icon.</w:t>
+        <w:t xml:space="preserve">To use this search bar </w:t>
+      </w:r>
+      <w:r>
+        <w:t xml:space="preserve">enter </w:t>
+      </w:r>
+      <w:r>
+        <w:t>the term that you would like to search then press enter or click the search icon.</w:t>
       </w:r>
     </w:p>
     <w:p>
@@ -8762,13 +7899,8 @@
           <w:numId w:val="24"/>
         </w:numPr>
       </w:pPr>
-      <w:proofErr w:type="gramStart"/>
-      <w:r>
-        <w:t>Second</w:t>
-      </w:r>
-      <w:proofErr w:type="gramEnd"/>
-      <w:r>
-        <w:t xml:space="preserve"> </w:t>
+      <w:r>
+        <w:t xml:space="preserve">Second </w:t>
       </w:r>
       <w:r>
         <w:t>you can search by clicking on any of the chips on the media view page. This will bring up any media items that share that chip.</w:t>
@@ -8826,15 +7958,7 @@
       </w:pPr>
       <w:r>
         <w:lastRenderedPageBreak/>
-        <w:t xml:space="preserve">There are 3 types of chips in the media view page. Genres, Recommenders, and Platforms. Platforms </w:t>
-      </w:r>
-      <w:proofErr w:type="gramStart"/>
-      <w:r>
-        <w:t>is</w:t>
-      </w:r>
-      <w:proofErr w:type="gramEnd"/>
-      <w:r>
-        <w:t xml:space="preserve"> a field specific to the game media type that is for listing what gaming platforms the game can be played on.</w:t>
+        <w:t>There are 3 types of chips in the media view page. Genres, Recommenders, and Platforms. Platforms is a field specific to the game media type that is for listing what gaming platforms the game can be played on.</w:t>
       </w:r>
     </w:p>
     <w:p>
@@ -9022,15 +8146,7 @@
         </w:numPr>
       </w:pPr>
       <w:r>
-        <w:t xml:space="preserve">To export your </w:t>
-      </w:r>
-      <w:proofErr w:type="gramStart"/>
-      <w:r>
-        <w:t>data</w:t>
-      </w:r>
-      <w:proofErr w:type="gramEnd"/>
-      <w:r>
-        <w:t xml:space="preserve"> click on the profile button in the top right and then select “Export Data”</w:t>
+        <w:t>To export your data click on the profile button in the top right and then select “Export Data”</w:t>
       </w:r>
     </w:p>
     <w:p>

</xml_diff>